<commit_message>
Refresh submission exports after research framing updates
</commit_message>
<xml_diff>
--- a/final-submission-v4/export/RA-MARS-journal-draft-final-v5-anonymous.docx
+++ b/final-submission-v4/export/RA-MARS-journal-draft-final-v5-anonymous.docx
@@ -144,15 +144,29 @@
         <w:pStyle w:val="BodyText"/>
       </w:pPr>
       <w:r>
-        <w:t xml:space="preserve">This paper proposes RA-MARS, a cross-layer mission assurance digital twin for secure multi-UAV defence surveillance under cyber-electromagnetic and navigation attacks. RA-MARS integrates temporal AI-based attack detection, a Mission Assurance Index, digital twin-based action selection, adaptive mission continuation, and tamper-resistant mission provenance. The framework converts communication, navigation, integrity, and mission-progress indicators into mission-level assurance decisions.</w:t>
-      </w:r>
-    </w:p>
-    <w:p>
-      <w:pPr>
-        <w:pStyle w:val="BodyText"/>
-      </w:pPr>
-      <w:r>
-        <w:t xml:space="preserve">A simulation-based v4 evaluation is conducted using synthetic multi-UAV telemetry data. The physics-based v4 dataset contains 90,000 sampled telemetry rows and 82,875 time-series windows, with 20 telemetry steps per window and 9 raw non-leakage features per step. The classifier excludes derived Mission Assurance Index and component scores from attack-detection inputs to avoid leakage. For attack-versus-normal mission assurance classification, Binary LSTM achieved 99.85% accuracy and 99.81% macro F1-score, while Binary GRU achieved 99.80% accuracy and 99.76% macro F1-score. For fine-grained eight-class mission-state classification, Weighted LSTM achieved 99.53% accuracy and 99.18% macro F1-score, while Weighted GRU achieved 99.24% accuracy and 98.66% macro F1-score. A 1D-CNN temporal baseline achieved 99.97% accuracy and 99.96% macro F1-score on the binary task, and 98.82% accuracy and 98.18% macro F1-score on the fine-grained task. These high classification scores should be interpreted within the controlled synthetic-telemetry setting: the data are simulation-generated, the attack signatures are physics-informed but not collected from real military flight tests, and the primary contribution of RA-MARS is the mission-assurance integration of detection, risk scoring, adaptive continuation, and tamper-evident provenance.</w:t>
+        <w:t xml:space="preserve">This paper proposes RA-MARS, a cross-layer mission assurance digital twin for secure multi-UAV defence surveillance under cyber-electromagnetic and navigation attacks. RA-MARS integrates temporal AI-based attack detection, a Mission Assurance Index, digital twin-based action selection, adaptive mission continuation, and tamper-evident mission provenance. The framework converts communication, navigation, integrity, and mission-progress indicators into mission-level assurance decisions.</w:t>
+      </w:r>
+    </w:p>
+    <w:p>
+      <w:pPr>
+        <w:pStyle w:val="BodyText"/>
+      </w:pPr>
+      <w:r>
+        <w:t xml:space="preserve">A simulation-based final validation evaluation is conducted using synthetic multi-UAV telemetry data. The physics-informed synthetic dataset contains 90,000 sampled telemetry rows and 82,875 time-series windows, with 20 telemetry steps per window and 9 raw non-leakage features per step. The classifier excludes derived Mission Assurance Index and component scores from attack-detection inputs to avoid leakage. For attack-versus-normal mission assurance classification, Binary LSTM achieved 99.85% accuracy and 99.81% macro F1-score, while Binary GRU achieved 99.80% accuracy and 99.76% macro F1-score. For fine-grained eight-class mission-state classification, Weighted LSTM achieved 99.53% accuracy and 99.18% macro F1-score, while Weighted GRU achieved 99.24% accuracy and 98.66% macro F1-score. A 1D-CNN temporal baseline achieved 99.97% accuracy and 99.96% macro F1-score on the binary task, and 98.82% accuracy and 98.18% macro F1-score on the fine-grained task.</w:t>
+      </w:r>
+    </w:p>
+    <w:p>
+      <w:pPr>
+        <w:pStyle w:val="BodyText"/>
+      </w:pPr>
+      <w:r>
+        <w:t xml:space="preserve">The high classification scores should be interpreted as evidence that the controlled physics-informed synthetic telemetry produces strongly separable attack signatures under the assumed simulation conditions. These values should not be interpreted as direct battlefield performance, real-flight deployment readiness, or validation on classified operational data. Therefore, the main contribution of RA-MARS is not classifier accuracy alone, but the integration of temporal attack detection with mission-risk scoring, adaptive mission continuation, RF/SINR-aware mission evaluation, and hash-chain-based tamper-evident mission provenance.</w:t>
+      </w:r>
+      <w:r>
+        <w:t xml:space="preserve"> </w:t>
+      </w:r>
+      <w:r>
+        <w:t xml:space="preserve">These high classification scores should be interpreted within the controlled synthetic-telemetry setting: the data are simulation-generated, the attack signatures are physics-informed but not collected from real military flight tests, and the primary contribution of RA-MARS is the mission-assurance integration of detection, risk scoring, adaptive continuation, and tamper-evident provenance.</w:t>
       </w:r>
     </w:p>
     <w:p>
@@ -168,7 +182,7 @@
         <w:pStyle w:val="BodyText"/>
       </w:pPr>
       <w:r>
-        <w:t xml:space="preserve">The results indicate that RA-MARS improves multi-UAV resilience by linking temporal attack detection, mission assurance scoring, adaptive action selection, operational recovery, and tamper-resistant mission provenance. The study provides simulation-based evidence for a defence-oriented mission assurance digital twin, while acknowledging that real UAV flight tests and hardware-in-the-loop validation are required before deployment claims can be made.</w:t>
+        <w:t xml:space="preserve">The results indicate that RA-MARS improves multi-UAV resilience by linking temporal attack detection, mission assurance scoring, adaptive action selection, operational recovery, and tamper-evident mission provenance. The study provides simulation-based evidence for a defence-oriented mission assurance digital twin, while acknowledging that real UAV flight tests and hardware-in-the-loop validation are required before deployment claims can be made.</w:t>
       </w:r>
     </w:p>
     <w:bookmarkStart w:id="14" w:name="keywords"/>
@@ -236,7 +250,7 @@
         <w:pStyle w:val="BodyText"/>
       </w:pPr>
       <w:r>
-        <w:t xml:space="preserve">To address this need, this paper proposes RA-MARS, a resilient AI-driven mission assurance framework for secure multi-UAV defence surveillance under jamming, GPS spoofing, and data-tampering attacks. RA-MARS integrates AI-based attack detection, mission-risk scoring, adaptive mission-continuation logic, and blockchain-inspired tamper-resistant mission logging. Instead of treating UAV cybersecurity, mission continuity, and data integrity as separate problems, RA-MARS connects them into a unified mission-assurance workflow.</w:t>
+        <w:t xml:space="preserve">To address this need, this paper proposes RA-MARS, a resilient AI-driven mission assurance framework for secure multi-UAV defence surveillance under jamming, GPS spoofing, and data-tampering attacks. RA-MARS integrates AI-based attack detection, mission-risk scoring, adaptive mission-continuation logic, and hash-chain-based tamper-evident mission provenance. Instead of treating UAV cybersecurity, mission continuity, and data integrity as separate problems, RA-MARS connects them into a unified mission-assurance workflow.</w:t>
       </w:r>
     </w:p>
     <w:p>
@@ -288,7 +302,7 @@
         </w:numPr>
       </w:pPr>
       <w:r>
-        <w:t xml:space="preserve">A blockchain-inspired tamper-resistant logging mechanism is incorporated to improve the integrity, traceability, and auditability of UAV mission records.</w:t>
+        <w:t xml:space="preserve">A hash-chain-based tamper-evident provenance mechanism is incorporated to improve the integrity, traceability, and auditability of UAV mission records.</w:t>
       </w:r>
     </w:p>
     <w:p>
@@ -307,7 +321,7 @@
         <w:pStyle w:val="FirstParagraph"/>
       </w:pPr>
       <w:r>
-        <w:t xml:space="preserve">The remainder of this paper is organized as follows. Section 2 reviews related work on UAV defence surveillance, AI-based attack detection, jamming and spoofing mitigation, UAV cybersecurity, and tamper-resistant mission logging. Section 3 presents the system model and threat model. Section 4 describes the proposed RA-MARS framework. Section 5 explains the experimental setup and evaluation metrics. Section 6 discusses the results and comparative analysis. Section 7 presents limitations and future work. Section 8 concludes the paper.</w:t>
+        <w:t xml:space="preserve">The remainder of this paper is organized as follows. Section 2 reviews related work on UAV defence surveillance, AI-based attack detection, jamming and spoofing mitigation, UAV cybersecurity, and tamper-evident mission provenance. Section 3 presents the system model and threat model. Section 4 describes the proposed RA-MARS framework. Section 5 explains the experimental setup and evaluation metrics. Section 6 discusses the results and comparative analysis. Section 7 presents limitations and future work. Section 8 concludes the paper.</w:t>
       </w:r>
     </w:p>
     <w:p>
@@ -341,7 +355,7 @@
         <w:pStyle w:val="FirstParagraph"/>
       </w:pPr>
       <w:r>
-        <w:t xml:space="preserve">This section reviews prior work related to UAV defence surveillance, contested UAV communication, GPS/GNSS spoofing, UAV cybersecurity, AI-based intrusion detection, tamper-resistant mission logging, and mission assurance. The purpose of this section is to identify the research gap that motivates RA-MARS.</w:t>
+        <w:t xml:space="preserve">This section reviews prior work related to UAV defence surveillance, contested UAV communication, GPS/GNSS spoofing, UAV cybersecurity, AI-based intrusion detection, tamper-evident mission provenance, and mission assurance. The purpose of this section is to identify the research gap that motivates RA-MARS.</w:t>
       </w:r>
     </w:p>
     <w:bookmarkEnd w:id="17"/>
@@ -471,7 +485,7 @@
         <w:pStyle w:val="BodyText"/>
       </w:pPr>
       <w:r>
-        <w:t xml:space="preserve">However, blockchain should not be treated as the main novelty of RA-MARS. Instead, tamper-resistant logging is used as a supporting component to preserve mission-data trustworthiness. Existing blockchain-UAV studies often focus on data integrity or authentication but do not fully connect log integrity with mission assurance under jamming, spoofing, and operational degradation.</w:t>
+        <w:t xml:space="preserve">However, blockchain should not be treated as the main novelty of RA-MARS. Instead, tamper-evident provenance is used as a supporting component to preserve mission-data trustworthiness. Existing blockchain-UAV studies often focus on data integrity or authentication but do not fully connect log integrity with mission assurance under jamming, spoofing, and operational degradation.</w:t>
       </w:r>
     </w:p>
     <w:bookmarkEnd w:id="22"/>
@@ -497,7 +511,7 @@
         <w:pStyle w:val="BodyText"/>
       </w:pPr>
       <w:r>
-        <w:t xml:space="preserve">These studies are important because they shift the focus from isolated attack prevention to operational continuity and recovery. However, many resilience models treat degradation abstractly and do not explicitly integrate cyber-electromagnetic threats such as jamming, spoofing, and mission-data tampering. RA-MARS addresses this gap by connecting cyber-physical attack detection, mission-risk scoring, adaptive mission continuation, and tamper-resistant logging in one framework.</w:t>
+        <w:t xml:space="preserve">These studies are important because they shift the focus from isolated attack prevention to operational continuity and recovery. However, many resilience models treat degradation abstractly and do not explicitly integrate cyber-electromagnetic threats such as jamming, spoofing, and mission-data tampering. RA-MARS addresses this gap by connecting cyber-physical attack detection, mission-risk scoring, adaptive mission continuation, and tamper-evident provenance in one framework.</w:t>
       </w:r>
     </w:p>
     <w:bookmarkEnd w:id="23"/>
@@ -549,7 +563,7 @@
         <w:pStyle w:val="FirstParagraph"/>
       </w:pPr>
       <w:r>
-        <w:t xml:space="preserve">RA-MARS is positioned as a resilient AI-driven mission assurance framework for secure multi-UAV defence surveillance in contested environments. Unlike prior studies that focus only on isolated security or optimization functions, RA-MARS integrates AI-based attack detection, mission-risk scoring, adaptive mission-continuation logic, and tamper-resistant mission logging.</w:t>
+        <w:t xml:space="preserve">RA-MARS is positioned as a resilient AI-driven mission assurance framework for secure multi-UAV defence surveillance in contested environments. Unlike prior studies that focus only on isolated security or optimization functions, RA-MARS integrates AI-based attack detection, mission-risk scoring, adaptive mission-continuation logic, and tamper-evident mission provenance.</w:t>
       </w:r>
     </w:p>
     <w:p>
@@ -575,7 +589,7 @@
         <w:pStyle w:val="FirstParagraph"/>
       </w:pPr>
       <w:r>
-        <w:t xml:space="preserve">The novelty of RA-MARS lies in treating UAV security as a mission-assurance problem rather than an isolated detection, communication, navigation, or logging problem. By integrating AI-based cyber-physical attack detection with mission-risk scoring, adaptive mission continuation, and tamper-resistant logging, RA-MARS provides a unified evaluation framework for secure multi-UAV defence surveillance under jamming, GPS spoofing, and data-tampering attacks.</w:t>
+        <w:t xml:space="preserve">The novelty of RA-MARS lies in treating UAV security as a mission-assurance problem rather than an isolated detection, communication, navigation, or logging problem. By integrating AI-based cyber-physical attack detection with mission-risk scoring, adaptive mission continuation, and tamper-evident provenance, RA-MARS provides a unified evaluation framework for secure multi-UAV defence surveillance under jamming, GPS spoofing, and data-tampering attacks.</w:t>
       </w:r>
     </w:p>
     <w:p>
@@ -587,7 +601,7 @@
     </w:p>
     <w:bookmarkEnd w:id="26"/>
     <w:bookmarkEnd w:id="27"/>
-    <w:bookmarkStart w:id="47" w:name="system-model-and-threat-model"/>
+    <w:bookmarkStart w:id="48" w:name="system-model-and-threat-model"/>
     <w:p>
       <w:pPr>
         <w:pStyle w:val="Heading1"/>
@@ -874,7 +888,7 @@
         <w:pStyle w:val="BodyText"/>
       </w:pPr>
       <w:r>
-        <w:t xml:space="preserve">RA-MARS uses a tamper-resistant logging model based on hash-chain or blockchain-inspired record linking. Each mission record includes the hash of the previous record and its own current hash. If any record is modified after storage, the recalculated hash will not match the stored hash, allowing tampering to be detected.</w:t>
+        <w:t xml:space="preserve">RA-MARS uses a tamper-evident provenance model based on hash-chain or blockchain-inspired record linking. Each mission record includes the hash of the previous record and its own current hash. If any record is modified after storage, the recalculated hash will not match the stored hash, allowing tampering to be detected.</w:t>
       </w:r>
     </w:p>
     <w:bookmarkEnd w:id="32"/>
@@ -1586,12 +1600,689 @@
       </w:r>
     </w:p>
     <w:bookmarkEnd w:id="44"/>
-    <w:bookmarkStart w:id="45" w:name="limitations"/>
+    <w:bookmarkStart w:id="45" w:name="qualitative-comparison-with-prior-work"/>
     <w:p>
       <w:pPr>
         <w:pStyle w:val="Heading2"/>
       </w:pPr>
       <w:r>
+        <w:t xml:space="preserve">Qualitative Comparison with Prior Work</w:t>
+      </w:r>
+    </w:p>
+    <w:p>
+      <w:pPr>
+        <w:pStyle w:val="FirstParagraph"/>
+      </w:pPr>
+      <w:r>
+        <w:t xml:space="preserve">Table X summarizes how RA-MARS differs from representative UAV security, anti-jamming, spoofing-resilient navigation, and UAV provenance studies. The comparison is qualitative because the present work uses a controlled synthetic telemetry workflow rather than the same datasets or testbeds used by prior studies.</w:t>
+      </w:r>
+    </w:p>
+    <w:tbl>
+      <w:tblPr>
+        <w:tblStyle w:val="Table"/>
+        <w:tblW w:type="pct" w:w="5000"/>
+        <w:tblLayout w:type="fixed"/>
+        <w:tblLook w:firstRow="1" w:lastRow="0" w:firstColumn="0" w:lastColumn="0" w:noHBand="0" w:noVBand="0" w:val="0020"/>
+      </w:tblPr>
+      <w:tblGrid>
+        <w:gridCol w:w="990"/>
+        <w:gridCol w:w="990"/>
+        <w:gridCol w:w="990"/>
+        <w:gridCol w:w="990"/>
+        <w:gridCol w:w="990"/>
+        <w:gridCol w:w="990"/>
+        <w:gridCol w:w="990"/>
+        <w:gridCol w:w="990"/>
+      </w:tblGrid>
+      <w:tr>
+        <w:trPr>
+          <w:tblHeader w:val="on"/>
+        </w:trPr>
+        <w:tc>
+          <w:tcPr/>
+          <w:p>
+            <w:pPr>
+              <w:pStyle w:val="Compact"/>
+            </w:pPr>
+            <w:r>
+              <w:t xml:space="preserve">Study category</w:t>
+            </w:r>
+          </w:p>
+        </w:tc>
+        <w:tc>
+          <w:tcPr/>
+          <w:p>
+            <w:pPr>
+              <w:pStyle w:val="Compact"/>
+            </w:pPr>
+            <w:r>
+              <w:t xml:space="preserve">Primary focus</w:t>
+            </w:r>
+          </w:p>
+        </w:tc>
+        <w:tc>
+          <w:tcPr/>
+          <w:p>
+            <w:pPr>
+              <w:pStyle w:val="Compact"/>
+            </w:pPr>
+            <w:r>
+              <w:t xml:space="preserve">Jamming</w:t>
+            </w:r>
+          </w:p>
+        </w:tc>
+        <w:tc>
+          <w:tcPr/>
+          <w:p>
+            <w:pPr>
+              <w:pStyle w:val="Compact"/>
+            </w:pPr>
+            <w:r>
+              <w:t xml:space="preserve">Spoofing</w:t>
+            </w:r>
+          </w:p>
+        </w:tc>
+        <w:tc>
+          <w:tcPr/>
+          <w:p>
+            <w:pPr>
+              <w:pStyle w:val="Compact"/>
+            </w:pPr>
+            <w:r>
+              <w:t xml:space="preserve">Data tampering</w:t>
+            </w:r>
+          </w:p>
+        </w:tc>
+        <w:tc>
+          <w:tcPr/>
+          <w:p>
+            <w:pPr>
+              <w:pStyle w:val="Compact"/>
+            </w:pPr>
+            <w:r>
+              <w:t xml:space="preserve">Mission-level assurance metric</w:t>
+            </w:r>
+          </w:p>
+        </w:tc>
+        <w:tc>
+          <w:tcPr/>
+          <w:p>
+            <w:pPr>
+              <w:pStyle w:val="Compact"/>
+            </w:pPr>
+            <w:r>
+              <w:t xml:space="preserve">Adaptive continuation</w:t>
+            </w:r>
+          </w:p>
+        </w:tc>
+        <w:tc>
+          <w:tcPr/>
+          <w:p>
+            <w:pPr>
+              <w:pStyle w:val="Compact"/>
+            </w:pPr>
+            <w:r>
+              <w:t xml:space="preserve">Tamper-evident provenance</w:t>
+            </w:r>
+          </w:p>
+        </w:tc>
+      </w:tr>
+      <w:tr>
+        <w:tc>
+          <w:tcPr/>
+          <w:p>
+            <w:pPr>
+              <w:pStyle w:val="Compact"/>
+            </w:pPr>
+            <w:r>
+              <w:t xml:space="preserve">UAV anti-jamming communication studies</w:t>
+            </w:r>
+          </w:p>
+        </w:tc>
+        <w:tc>
+          <w:tcPr/>
+          <w:p>
+            <w:pPr>
+              <w:pStyle w:val="Compact"/>
+            </w:pPr>
+            <w:r>
+              <w:t xml:space="preserve">Link reliability and communication recovery</w:t>
+            </w:r>
+          </w:p>
+        </w:tc>
+        <w:tc>
+          <w:tcPr/>
+          <w:p>
+            <w:pPr>
+              <w:pStyle w:val="Compact"/>
+            </w:pPr>
+            <w:r>
+              <w:t xml:space="preserve">Yes</w:t>
+            </w:r>
+          </w:p>
+        </w:tc>
+        <w:tc>
+          <w:tcPr/>
+          <w:p>
+            <w:pPr>
+              <w:pStyle w:val="Compact"/>
+            </w:pPr>
+            <w:r>
+              <w:t xml:space="preserve">Limited</w:t>
+            </w:r>
+          </w:p>
+        </w:tc>
+        <w:tc>
+          <w:tcPr/>
+          <w:p>
+            <w:pPr>
+              <w:pStyle w:val="Compact"/>
+            </w:pPr>
+            <w:r>
+              <w:t xml:space="preserve">No</w:t>
+            </w:r>
+          </w:p>
+        </w:tc>
+        <w:tc>
+          <w:tcPr/>
+          <w:p>
+            <w:pPr>
+              <w:pStyle w:val="Compact"/>
+            </w:pPr>
+            <w:r>
+              <w:t xml:space="preserve">Usually no</w:t>
+            </w:r>
+          </w:p>
+        </w:tc>
+        <w:tc>
+          <w:tcPr/>
+          <w:p>
+            <w:pPr>
+              <w:pStyle w:val="Compact"/>
+            </w:pPr>
+            <w:r>
+              <w:t xml:space="preserve">Sometimes</w:t>
+            </w:r>
+          </w:p>
+        </w:tc>
+        <w:tc>
+          <w:tcPr/>
+          <w:p>
+            <w:pPr>
+              <w:pStyle w:val="Compact"/>
+            </w:pPr>
+            <w:r>
+              <w:t xml:space="preserve">No</w:t>
+            </w:r>
+          </w:p>
+        </w:tc>
+      </w:tr>
+      <w:tr>
+        <w:tc>
+          <w:tcPr/>
+          <w:p>
+            <w:pPr>
+              <w:pStyle w:val="Compact"/>
+            </w:pPr>
+            <w:r>
+              <w:t xml:space="preserve">UAV GNSS spoofing/navigation studies</w:t>
+            </w:r>
+          </w:p>
+        </w:tc>
+        <w:tc>
+          <w:tcPr/>
+          <w:p>
+            <w:pPr>
+              <w:pStyle w:val="Compact"/>
+            </w:pPr>
+            <w:r>
+              <w:t xml:space="preserve">Navigation trust and localization resilience</w:t>
+            </w:r>
+          </w:p>
+        </w:tc>
+        <w:tc>
+          <w:tcPr/>
+          <w:p>
+            <w:pPr>
+              <w:pStyle w:val="Compact"/>
+            </w:pPr>
+            <w:r>
+              <w:t xml:space="preserve">Limited</w:t>
+            </w:r>
+          </w:p>
+        </w:tc>
+        <w:tc>
+          <w:tcPr/>
+          <w:p>
+            <w:pPr>
+              <w:pStyle w:val="Compact"/>
+            </w:pPr>
+            <w:r>
+              <w:t xml:space="preserve">Yes</w:t>
+            </w:r>
+          </w:p>
+        </w:tc>
+        <w:tc>
+          <w:tcPr/>
+          <w:p>
+            <w:pPr>
+              <w:pStyle w:val="Compact"/>
+            </w:pPr>
+            <w:r>
+              <w:t xml:space="preserve">No</w:t>
+            </w:r>
+          </w:p>
+        </w:tc>
+        <w:tc>
+          <w:tcPr/>
+          <w:p>
+            <w:pPr>
+              <w:pStyle w:val="Compact"/>
+            </w:pPr>
+            <w:r>
+              <w:t xml:space="preserve">Usually no</w:t>
+            </w:r>
+          </w:p>
+        </w:tc>
+        <w:tc>
+          <w:tcPr/>
+          <w:p>
+            <w:pPr>
+              <w:pStyle w:val="Compact"/>
+            </w:pPr>
+            <w:r>
+              <w:t xml:space="preserve">Limited</w:t>
+            </w:r>
+          </w:p>
+        </w:tc>
+        <w:tc>
+          <w:tcPr/>
+          <w:p>
+            <w:pPr>
+              <w:pStyle w:val="Compact"/>
+            </w:pPr>
+            <w:r>
+              <w:t xml:space="preserve">No</w:t>
+            </w:r>
+          </w:p>
+        </w:tc>
+      </w:tr>
+      <w:tr>
+        <w:tc>
+          <w:tcPr/>
+          <w:p>
+            <w:pPr>
+              <w:pStyle w:val="Compact"/>
+            </w:pPr>
+            <w:r>
+              <w:t xml:space="preserve">UAV cyber-intrusion detection studies</w:t>
+            </w:r>
+          </w:p>
+        </w:tc>
+        <w:tc>
+          <w:tcPr/>
+          <w:p>
+            <w:pPr>
+              <w:pStyle w:val="Compact"/>
+            </w:pPr>
+            <w:r>
+              <w:t xml:space="preserve">Attack classification or anomaly detection</w:t>
+            </w:r>
+          </w:p>
+        </w:tc>
+        <w:tc>
+          <w:tcPr/>
+          <w:p>
+            <w:pPr>
+              <w:pStyle w:val="Compact"/>
+            </w:pPr>
+            <w:r>
+              <w:t xml:space="preserve">Sometimes</w:t>
+            </w:r>
+          </w:p>
+        </w:tc>
+        <w:tc>
+          <w:tcPr/>
+          <w:p>
+            <w:pPr>
+              <w:pStyle w:val="Compact"/>
+            </w:pPr>
+            <w:r>
+              <w:t xml:space="preserve">Sometimes</w:t>
+            </w:r>
+          </w:p>
+        </w:tc>
+        <w:tc>
+          <w:tcPr/>
+          <w:p>
+            <w:pPr>
+              <w:pStyle w:val="Compact"/>
+            </w:pPr>
+            <w:r>
+              <w:t xml:space="preserve">Sometimes</w:t>
+            </w:r>
+          </w:p>
+        </w:tc>
+        <w:tc>
+          <w:tcPr/>
+          <w:p>
+            <w:pPr>
+              <w:pStyle w:val="Compact"/>
+            </w:pPr>
+            <w:r>
+              <w:t xml:space="preserve">Usually no</w:t>
+            </w:r>
+          </w:p>
+        </w:tc>
+        <w:tc>
+          <w:tcPr/>
+          <w:p>
+            <w:pPr>
+              <w:pStyle w:val="Compact"/>
+            </w:pPr>
+            <w:r>
+              <w:t xml:space="preserve">No</w:t>
+            </w:r>
+          </w:p>
+        </w:tc>
+        <w:tc>
+          <w:tcPr/>
+          <w:p>
+            <w:pPr>
+              <w:pStyle w:val="Compact"/>
+            </w:pPr>
+            <w:r>
+              <w:t xml:space="preserve">No</w:t>
+            </w:r>
+          </w:p>
+        </w:tc>
+      </w:tr>
+      <w:tr>
+        <w:tc>
+          <w:tcPr/>
+          <w:p>
+            <w:pPr>
+              <w:pStyle w:val="Compact"/>
+            </w:pPr>
+            <w:r>
+              <w:t xml:space="preserve">Blockchain/UAV logging studies</w:t>
+            </w:r>
+          </w:p>
+        </w:tc>
+        <w:tc>
+          <w:tcPr/>
+          <w:p>
+            <w:pPr>
+              <w:pStyle w:val="Compact"/>
+            </w:pPr>
+            <w:r>
+              <w:t xml:space="preserve">Data integrity, auditability, or authentication</w:t>
+            </w:r>
+          </w:p>
+        </w:tc>
+        <w:tc>
+          <w:tcPr/>
+          <w:p>
+            <w:pPr>
+              <w:pStyle w:val="Compact"/>
+            </w:pPr>
+            <w:r>
+              <w:t xml:space="preserve">No</w:t>
+            </w:r>
+          </w:p>
+        </w:tc>
+        <w:tc>
+          <w:tcPr/>
+          <w:p>
+            <w:pPr>
+              <w:pStyle w:val="Compact"/>
+            </w:pPr>
+            <w:r>
+              <w:t xml:space="preserve">No</w:t>
+            </w:r>
+          </w:p>
+        </w:tc>
+        <w:tc>
+          <w:tcPr/>
+          <w:p>
+            <w:pPr>
+              <w:pStyle w:val="Compact"/>
+            </w:pPr>
+            <w:r>
+              <w:t xml:space="preserve">Yes</w:t>
+            </w:r>
+          </w:p>
+        </w:tc>
+        <w:tc>
+          <w:tcPr/>
+          <w:p>
+            <w:pPr>
+              <w:pStyle w:val="Compact"/>
+            </w:pPr>
+            <w:r>
+              <w:t xml:space="preserve">No</w:t>
+            </w:r>
+          </w:p>
+        </w:tc>
+        <w:tc>
+          <w:tcPr/>
+          <w:p>
+            <w:pPr>
+              <w:pStyle w:val="Compact"/>
+            </w:pPr>
+            <w:r>
+              <w:t xml:space="preserve">No</w:t>
+            </w:r>
+          </w:p>
+        </w:tc>
+        <w:tc>
+          <w:tcPr/>
+          <w:p>
+            <w:pPr>
+              <w:pStyle w:val="Compact"/>
+            </w:pPr>
+            <w:r>
+              <w:t xml:space="preserve">Yes</w:t>
+            </w:r>
+          </w:p>
+        </w:tc>
+      </w:tr>
+      <w:tr>
+        <w:tc>
+          <w:tcPr/>
+          <w:p>
+            <w:pPr>
+              <w:pStyle w:val="Compact"/>
+            </w:pPr>
+            <w:r>
+              <w:t xml:space="preserve">Multi-UAV mission planning studies</w:t>
+            </w:r>
+          </w:p>
+        </w:tc>
+        <w:tc>
+          <w:tcPr/>
+          <w:p>
+            <w:pPr>
+              <w:pStyle w:val="Compact"/>
+            </w:pPr>
+            <w:r>
+              <w:t xml:space="preserve">Task allocation, route planning, or swarm coordination</w:t>
+            </w:r>
+          </w:p>
+        </w:tc>
+        <w:tc>
+          <w:tcPr/>
+          <w:p>
+            <w:pPr>
+              <w:pStyle w:val="Compact"/>
+            </w:pPr>
+            <w:r>
+              <w:t xml:space="preserve">Sometimes</w:t>
+            </w:r>
+          </w:p>
+        </w:tc>
+        <w:tc>
+          <w:tcPr/>
+          <w:p>
+            <w:pPr>
+              <w:pStyle w:val="Compact"/>
+            </w:pPr>
+            <w:r>
+              <w:t xml:space="preserve">Limited</w:t>
+            </w:r>
+          </w:p>
+        </w:tc>
+        <w:tc>
+          <w:tcPr/>
+          <w:p>
+            <w:pPr>
+              <w:pStyle w:val="Compact"/>
+            </w:pPr>
+            <w:r>
+              <w:t xml:space="preserve">No</w:t>
+            </w:r>
+          </w:p>
+        </w:tc>
+        <w:tc>
+          <w:tcPr/>
+          <w:p>
+            <w:pPr>
+              <w:pStyle w:val="Compact"/>
+            </w:pPr>
+            <w:r>
+              <w:t xml:space="preserve">Sometimes</w:t>
+            </w:r>
+          </w:p>
+        </w:tc>
+        <w:tc>
+          <w:tcPr/>
+          <w:p>
+            <w:pPr>
+              <w:pStyle w:val="Compact"/>
+            </w:pPr>
+            <w:r>
+              <w:t xml:space="preserve">Yes</w:t>
+            </w:r>
+          </w:p>
+        </w:tc>
+        <w:tc>
+          <w:tcPr/>
+          <w:p>
+            <w:pPr>
+              <w:pStyle w:val="Compact"/>
+            </w:pPr>
+            <w:r>
+              <w:t xml:space="preserve">No</w:t>
+            </w:r>
+          </w:p>
+        </w:tc>
+      </w:tr>
+      <w:tr>
+        <w:tc>
+          <w:tcPr/>
+          <w:p>
+            <w:pPr>
+              <w:pStyle w:val="Compact"/>
+            </w:pPr>
+            <w:r>
+              <w:t xml:space="preserve">Proposed RA-MARS framework</w:t>
+            </w:r>
+          </w:p>
+        </w:tc>
+        <w:tc>
+          <w:tcPr/>
+          <w:p>
+            <w:pPr>
+              <w:pStyle w:val="Compact"/>
+            </w:pPr>
+            <w:r>
+              <w:t xml:space="preserve">Cross-layer mission assurance for contested UAV surveillance</w:t>
+            </w:r>
+          </w:p>
+        </w:tc>
+        <w:tc>
+          <w:tcPr/>
+          <w:p>
+            <w:pPr>
+              <w:pStyle w:val="Compact"/>
+            </w:pPr>
+            <w:r>
+              <w:t xml:space="preserve">Yes</w:t>
+            </w:r>
+          </w:p>
+        </w:tc>
+        <w:tc>
+          <w:tcPr/>
+          <w:p>
+            <w:pPr>
+              <w:pStyle w:val="Compact"/>
+            </w:pPr>
+            <w:r>
+              <w:t xml:space="preserve">Yes</w:t>
+            </w:r>
+          </w:p>
+        </w:tc>
+        <w:tc>
+          <w:tcPr/>
+          <w:p>
+            <w:pPr>
+              <w:pStyle w:val="Compact"/>
+            </w:pPr>
+            <w:r>
+              <w:t xml:space="preserve">Yes</w:t>
+            </w:r>
+          </w:p>
+        </w:tc>
+        <w:tc>
+          <w:tcPr/>
+          <w:p>
+            <w:pPr>
+              <w:pStyle w:val="Compact"/>
+            </w:pPr>
+            <w:r>
+              <w:t xml:space="preserve">Yes</w:t>
+            </w:r>
+          </w:p>
+        </w:tc>
+        <w:tc>
+          <w:tcPr/>
+          <w:p>
+            <w:pPr>
+              <w:pStyle w:val="Compact"/>
+            </w:pPr>
+            <w:r>
+              <w:t xml:space="preserve">Yes</w:t>
+            </w:r>
+          </w:p>
+        </w:tc>
+        <w:tc>
+          <w:tcPr/>
+          <w:p>
+            <w:pPr>
+              <w:pStyle w:val="Compact"/>
+            </w:pPr>
+            <w:r>
+              <w:t xml:space="preserve">Yes</w:t>
+            </w:r>
+          </w:p>
+        </w:tc>
+      </w:tr>
+    </w:tbl>
+    <w:p>
+      <w:pPr>
+        <w:pStyle w:val="BodyText"/>
+      </w:pPr>
+      <w:r>
+        <w:t xml:space="preserve">This comparison highlights that RA-MARS is designed as a mission-assurance framework rather than a standalone classifier, communication-security module, navigation filter, or logging mechanism. Its novelty lies in connecting attack detection, mission-risk scoring, adaptive continuation, and tamper-evident mission provenance under combined cyber-electromagnetic and navigation threats.</w:t>
+      </w:r>
+    </w:p>
+    <w:bookmarkEnd w:id="45"/>
+    <w:bookmarkStart w:id="46" w:name="limitations"/>
+    <w:p>
+      <w:pPr>
+        <w:pStyle w:val="Heading2"/>
+      </w:pPr>
+      <w:r>
         <w:t xml:space="preserve">Limitations</w:t>
       </w:r>
     </w:p>
@@ -1695,8 +2386,8 @@
         <w:t xml:space="preserve">These limitations should be acknowledged in the final manuscript and addressed as future work.</w:t>
       </w:r>
     </w:p>
-    <w:bookmarkEnd w:id="45"/>
-    <w:bookmarkStart w:id="46" w:name="ra-mars-security-objectives"/>
+    <w:bookmarkEnd w:id="46"/>
+    <w:bookmarkStart w:id="47" w:name="ra-mars-security-objectives"/>
     <w:p>
       <w:pPr>
         <w:pStyle w:val="Heading2"/>
@@ -1792,9 +2483,9 @@
         </w:pict>
       </w:r>
     </w:p>
-    <w:bookmarkEnd w:id="46"/>
     <w:bookmarkEnd w:id="47"/>
-    <w:bookmarkStart w:id="66" w:name="methodology"/>
+    <w:bookmarkEnd w:id="48"/>
+    <w:bookmarkStart w:id="67" w:name="methodology"/>
     <w:p>
       <w:pPr>
         <w:pStyle w:val="Heading1"/>
@@ -1803,7 +2494,7 @@
         <w:t xml:space="preserve">Methodology</w:t>
       </w:r>
     </w:p>
-    <w:bookmarkStart w:id="48" w:name="overview-of-ra-mars"/>
+    <w:bookmarkStart w:id="49" w:name="overview-of-ra-mars"/>
     <w:p>
       <w:pPr>
         <w:pStyle w:val="Heading2"/>
@@ -1873,7 +2564,7 @@
         </w:numPr>
       </w:pPr>
       <w:r>
-        <w:t xml:space="preserve">Blockchain-inspired tamper-resistant mission logging</w:t>
+        <w:t xml:space="preserve">Hash-chain-based tamper-evident mission provenance</w:t>
       </w:r>
     </w:p>
     <w:p>
@@ -1884,8 +2575,8 @@
         <w:t xml:space="preserve">These modules operate together to detect abnormal mission conditions, estimate the severity of operational degradation, support adaptive mission decisions, and preserve trustworthy mission records.</w:t>
       </w:r>
     </w:p>
-    <w:bookmarkEnd w:id="48"/>
-    <w:bookmarkStart w:id="49" w:name="system-architecture"/>
+    <w:bookmarkEnd w:id="49"/>
+    <w:bookmarkStart w:id="50" w:name="system-architecture"/>
     <w:p>
       <w:pPr>
         <w:pStyle w:val="Heading2"/>
@@ -2006,8 +2697,8 @@
         <w:t xml:space="preserve">Each UAV periodically transmits telemetry information, including location, velocity, battery level, communication status, mission-zone progress, and sensor status. The ground control station receives UAV telemetry and evaluates whether mission behavior is normal or potentially affected by adversarial conditions.</w:t>
       </w:r>
     </w:p>
-    <w:bookmarkEnd w:id="49"/>
-    <w:bookmarkStart w:id="50" w:name="multi-uav-surveillance-layer"/>
+    <w:bookmarkEnd w:id="50"/>
+    <w:bookmarkStart w:id="51" w:name="multi-uav-surveillance-layer"/>
     <w:p>
       <w:pPr>
         <w:pStyle w:val="Heading2"/>
@@ -2032,8 +2723,8 @@
         <w:t xml:space="preserve">The surveillance mission is considered successful when a predefined percentage of mission zones is covered within the mission duration while maintaining acceptable communication reliability and navigation consistency.</w:t>
       </w:r>
     </w:p>
-    <w:bookmarkEnd w:id="50"/>
-    <w:bookmarkStart w:id="54" w:name="threat-model-1"/>
+    <w:bookmarkEnd w:id="51"/>
+    <w:bookmarkStart w:id="55" w:name="threat-model-1"/>
     <w:p>
       <w:pPr>
         <w:pStyle w:val="Heading2"/>
@@ -2050,7 +2741,7 @@
         <w:t xml:space="preserve">RA-MARS considers three major attack types:</w:t>
       </w:r>
     </w:p>
-    <w:bookmarkStart w:id="51" w:name="rf-jamming"/>
+    <w:bookmarkStart w:id="52" w:name="rf-jamming"/>
     <w:p>
       <w:pPr>
         <w:pStyle w:val="Heading3"/>
@@ -2067,8 +2758,8 @@
         <w:t xml:space="preserve">RF jamming disrupts UAV communication by increasing packet loss and communication latency. In the simulation, jamming is modeled by reducing packet delivery ratio and increasing communication delay for affected UAV nodes.</w:t>
       </w:r>
     </w:p>
-    <w:bookmarkEnd w:id="51"/>
-    <w:bookmarkStart w:id="52" w:name="gps-spoofing"/>
+    <w:bookmarkEnd w:id="52"/>
+    <w:bookmarkStart w:id="53" w:name="gps-spoofing"/>
     <w:p>
       <w:pPr>
         <w:pStyle w:val="Heading3"/>
@@ -2085,8 +2776,8 @@
         <w:t xml:space="preserve">GPS spoofing manipulates UAV navigation by injecting false location values. In the simulation, spoofing is modeled through abnormal location jumps, gradual position drift, and inconsistent movement patterns.</w:t>
       </w:r>
     </w:p>
-    <w:bookmarkEnd w:id="52"/>
-    <w:bookmarkStart w:id="53" w:name="data-tampering"/>
+    <w:bookmarkEnd w:id="53"/>
+    <w:bookmarkStart w:id="54" w:name="data-tampering"/>
     <w:p>
       <w:pPr>
         <w:pStyle w:val="Heading3"/>
@@ -2103,9 +2794,9 @@
         <w:t xml:space="preserve">Data tampering modifies mission telemetry records or surveillance logs after collection. In the simulation, tampering is modeled by altering selected records, including location values, timestamps, mission status, or UAV identifiers.</w:t>
       </w:r>
     </w:p>
-    <w:bookmarkEnd w:id="53"/>
     <w:bookmarkEnd w:id="54"/>
-    <w:bookmarkStart w:id="58" w:name="ai-based-attack-detection-module"/>
+    <w:bookmarkEnd w:id="55"/>
+    <w:bookmarkStart w:id="59" w:name="ai-based-attack-detection-module"/>
     <w:p>
       <w:pPr>
         <w:pStyle w:val="Heading2"/>
@@ -2122,7 +2813,7 @@
         <w:t xml:space="preserve">The AI-based attack detection module classifies mission states as normal or attacked based on UAV telemetry and mission-status features.</w:t>
       </w:r>
     </w:p>
-    <w:bookmarkStart w:id="55" w:name="input-features"/>
+    <w:bookmarkStart w:id="56" w:name="input-features"/>
     <w:p>
       <w:pPr>
         <w:pStyle w:val="Heading3"/>
@@ -2235,8 +2926,8 @@
         <w:t xml:space="preserve">Log integrity status</w:t>
       </w:r>
     </w:p>
-    <w:bookmarkEnd w:id="55"/>
-    <w:bookmarkStart w:id="56" w:name="output-classes"/>
+    <w:bookmarkEnd w:id="56"/>
+    <w:bookmarkStart w:id="57" w:name="output-classes"/>
     <w:p>
       <w:pPr>
         <w:pStyle w:val="Heading3"/>
@@ -2313,8 +3004,8 @@
         <w:t xml:space="preserve">Combined attack</w:t>
       </w:r>
     </w:p>
-    <w:bookmarkEnd w:id="56"/>
-    <w:bookmarkStart w:id="57" w:name="candidate-models"/>
+    <w:bookmarkEnd w:id="57"/>
+    <w:bookmarkStart w:id="58" w:name="candidate-models"/>
     <w:p>
       <w:pPr>
         <w:pStyle w:val="Heading3"/>
@@ -2399,9 +3090,9 @@
         <w:t xml:space="preserve">The best-performing model was selected based on accuracy, precision, recall, and F1-score.</w:t>
       </w:r>
     </w:p>
-    <w:bookmarkEnd w:id="57"/>
     <w:bookmarkEnd w:id="58"/>
-    <w:bookmarkStart w:id="59" w:name="mission-risk-scoring-module"/>
+    <w:bookmarkEnd w:id="59"/>
+    <w:bookmarkStart w:id="60" w:name="mission-risk-scoring-module"/>
     <w:p>
       <w:pPr>
         <w:pStyle w:val="Heading2"/>
@@ -2676,8 +3367,8 @@
         </w:tc>
       </w:tr>
     </w:tbl>
-    <w:bookmarkEnd w:id="59"/>
-    <w:bookmarkStart w:id="60" w:name="adaptive-mission-continuation-logic"/>
+    <w:bookmarkEnd w:id="60"/>
+    <w:bookmarkStart w:id="61" w:name="adaptive-mission-continuation-logic"/>
     <w:p>
       <w:pPr>
         <w:pStyle w:val="Heading2"/>
@@ -2782,8 +3473,8 @@
         <w:t xml:space="preserve">The purpose of this module is not only to detect attacks but also to preserve mission success under degraded conditions.</w:t>
       </w:r>
     </w:p>
-    <w:bookmarkEnd w:id="60"/>
-    <w:bookmarkStart w:id="61" w:name="tamper-resistant-mission-logging-module"/>
+    <w:bookmarkEnd w:id="61"/>
+    <w:bookmarkStart w:id="62" w:name="tamper-resistant-mission-logging-module"/>
     <w:p>
       <w:pPr>
         <w:pStyle w:val="Heading2"/>
@@ -2797,7 +3488,7 @@
         <w:pStyle w:val="FirstParagraph"/>
       </w:pPr>
       <w:r>
-        <w:t xml:space="preserve">The tamper-resistant logging module preserves the integrity and traceability of mission records. Each mission record is linked to the previous record using a hash-chain or blockchain-inspired structure.</w:t>
+        <w:t xml:space="preserve">The tamper-evident provenance module preserves the integrity and traceability of mission records. Each mission record is linked to the previous record using a hash-chain or blockchain-inspired structure.</w:t>
       </w:r>
     </w:p>
     <w:p>
@@ -2924,8 +3615,8 @@
         <w:t xml:space="preserve">If any record is modified after storage, the recalculated hash will not match the stored hash. This allows tampered records to be detected during verification.</w:t>
       </w:r>
     </w:p>
-    <w:bookmarkEnd w:id="61"/>
-    <w:bookmarkStart w:id="62" w:name="ra-mars-workflow"/>
+    <w:bookmarkEnd w:id="62"/>
+    <w:bookmarkStart w:id="63" w:name="ra-mars-workflow"/>
     <w:p>
       <w:pPr>
         <w:pStyle w:val="Heading2"/>
@@ -3011,7 +3702,7 @@
         </w:numPr>
       </w:pPr>
       <w:r>
-        <w:t xml:space="preserve">Mission records are stored using tamper-resistant logging.</w:t>
+        <w:t xml:space="preserve">Mission records are stored using tamper-evident provenance.</w:t>
       </w:r>
     </w:p>
     <w:p>
@@ -3026,8 +3717,8 @@
         <w:t xml:space="preserve">Performance metrics are calculated for evaluation.</w:t>
       </w:r>
     </w:p>
-    <w:bookmarkEnd w:id="62"/>
-    <w:bookmarkStart w:id="63" w:name="evaluation-strategy"/>
+    <w:bookmarkEnd w:id="63"/>
+    <w:bookmarkStart w:id="64" w:name="evaluation-strategy"/>
     <w:p>
       <w:pPr>
         <w:pStyle w:val="Heading2"/>
@@ -3172,8 +3863,8 @@
         <w:t xml:space="preserve">Proposed RA-MARS framework</w:t>
       </w:r>
     </w:p>
-    <w:bookmarkEnd w:id="63"/>
-    <w:bookmarkStart w:id="64" w:name="evaluation-metrics"/>
+    <w:bookmarkEnd w:id="64"/>
+    <w:bookmarkStart w:id="65" w:name="evaluation-metrics"/>
     <w:p>
       <w:pPr>
         <w:pStyle w:val="Heading2"/>
@@ -3310,8 +4001,8 @@
         <w:t xml:space="preserve">Mission recovery time</w:t>
       </w:r>
     </w:p>
-    <w:bookmarkEnd w:id="64"/>
-    <w:bookmarkStart w:id="65" w:name="methodological-positioning"/>
+    <w:bookmarkEnd w:id="65"/>
+    <w:bookmarkStart w:id="66" w:name="methodological-positioning"/>
     <w:p>
       <w:pPr>
         <w:pStyle w:val="Heading2"/>
@@ -3335,9 +4026,9 @@
         </w:pict>
       </w:r>
     </w:p>
-    <w:bookmarkEnd w:id="65"/>
     <w:bookmarkEnd w:id="66"/>
-    <w:bookmarkStart w:id="88" w:name="experimental-setup"/>
+    <w:bookmarkEnd w:id="67"/>
+    <w:bookmarkStart w:id="89" w:name="experimental-setup"/>
     <w:p>
       <w:pPr>
         <w:pStyle w:val="Heading1"/>
@@ -3346,7 +4037,7 @@
         <w:t xml:space="preserve">Experimental Setup</w:t>
       </w:r>
     </w:p>
-    <w:bookmarkStart w:id="67" w:name="overview-1"/>
+    <w:bookmarkStart w:id="68" w:name="overview-1"/>
     <w:p>
       <w:pPr>
         <w:pStyle w:val="Heading2"/>
@@ -3439,8 +4130,8 @@
         <w:t xml:space="preserve">RA-MARS is compared against multiple baseline systems using attack-detection, communication, navigation, integrity, energy, and mission-level performance metrics.</w:t>
       </w:r>
     </w:p>
-    <w:bookmarkEnd w:id="67"/>
-    <w:bookmarkStart w:id="68" w:name="simulation-environment"/>
+    <w:bookmarkEnd w:id="68"/>
+    <w:bookmarkStart w:id="69" w:name="simulation-environment"/>
     <w:p>
       <w:pPr>
         <w:pStyle w:val="Heading2"/>
@@ -3465,8 +4156,8 @@
         <w:t xml:space="preserve">The simulation generates synthetic UAV telemetry data and attack events. The generated dataset is used to train and evaluate AI-based attack detection models and to compare RA-MARS with baseline systems.</w:t>
       </w:r>
     </w:p>
-    <w:bookmarkEnd w:id="68"/>
-    <w:bookmarkStart w:id="69" w:name="mission-scenario"/>
+    <w:bookmarkEnd w:id="69"/>
+    <w:bookmarkStart w:id="70" w:name="mission-scenario"/>
     <w:p>
       <w:pPr>
         <w:pStyle w:val="Heading2"/>
@@ -3583,8 +4274,8 @@
         <w:t xml:space="preserve">Each UAV is assigned one or more zones and must report telemetry at fixed intervals. Mission success is measured based on completed zone coverage, communication reliability, navigation consistency, and mission-data integrity.</w:t>
       </w:r>
     </w:p>
-    <w:bookmarkEnd w:id="69"/>
-    <w:bookmarkStart w:id="70" w:name="simulation-parameters"/>
+    <w:bookmarkEnd w:id="70"/>
+    <w:bookmarkStart w:id="71" w:name="simulation-parameters"/>
     <w:p>
       <w:pPr>
         <w:pStyle w:val="Heading2"/>
@@ -3882,8 +4573,8 @@
         </w:tc>
       </w:tr>
     </w:tbl>
-    <w:bookmarkEnd w:id="70"/>
-    <w:bookmarkStart w:id="76" w:name="attack-scenarios"/>
+    <w:bookmarkEnd w:id="71"/>
+    <w:bookmarkStart w:id="77" w:name="attack-scenarios"/>
     <w:p>
       <w:pPr>
         <w:pStyle w:val="Heading2"/>
@@ -3892,7 +4583,7 @@
         <w:t xml:space="preserve">Attack Scenarios</w:t>
       </w:r>
     </w:p>
-    <w:bookmarkStart w:id="71" w:name="scenario-1-normal-operation"/>
+    <w:bookmarkStart w:id="72" w:name="scenario-1-normal-operation"/>
     <w:p>
       <w:pPr>
         <w:pStyle w:val="Heading3"/>
@@ -3909,8 +4600,8 @@
         <w:t xml:space="preserve">No attack is applied. UAVs perform surveillance, transmit telemetry, and update mission logs under normal operating conditions.</w:t>
       </w:r>
     </w:p>
-    <w:bookmarkEnd w:id="71"/>
-    <w:bookmarkStart w:id="72" w:name="scenario-2-rf-jamming"/>
+    <w:bookmarkEnd w:id="72"/>
+    <w:bookmarkStart w:id="73" w:name="scenario-2-rf-jamming"/>
     <w:p>
       <w:pPr>
         <w:pStyle w:val="Heading3"/>
@@ -3995,8 +4686,8 @@
         <w:t xml:space="preserve">additional latency</w:t>
       </w:r>
     </w:p>
-    <w:bookmarkEnd w:id="72"/>
-    <w:bookmarkStart w:id="73" w:name="scenario-3-gpsgnss-spoofing"/>
+    <w:bookmarkEnd w:id="73"/>
+    <w:bookmarkStart w:id="74" w:name="scenario-3-gpsgnss-spoofing"/>
     <w:p>
       <w:pPr>
         <w:pStyle w:val="Heading3"/>
@@ -4081,8 +4772,8 @@
         <w:t xml:space="preserve">incorrect mission-zone reporting</w:t>
       </w:r>
     </w:p>
-    <w:bookmarkEnd w:id="73"/>
-    <w:bookmarkStart w:id="74" w:name="scenario-4-mission-data-tampering"/>
+    <w:bookmarkEnd w:id="74"/>
+    <w:bookmarkStart w:id="75" w:name="scenario-4-mission-data-tampering"/>
     <w:p>
       <w:pPr>
         <w:pStyle w:val="Heading3"/>
@@ -4155,8 +4846,8 @@
         <w:t xml:space="preserve">broken hash-chain verification</w:t>
       </w:r>
     </w:p>
-    <w:bookmarkEnd w:id="74"/>
-    <w:bookmarkStart w:id="75" w:name="scenario-5-combined-attack"/>
+    <w:bookmarkEnd w:id="75"/>
+    <w:bookmarkStart w:id="76" w:name="scenario-5-combined-attack"/>
     <w:p>
       <w:pPr>
         <w:pStyle w:val="Heading3"/>
@@ -4173,9 +4864,9 @@
         <w:t xml:space="preserve">The combined attack scenario applies RF jamming, GPS/GNSS spoofing, and mission-data tampering within the same mission. This scenario evaluates the ability of RA-MARS to support mission assurance under simultaneous cyber-electromagnetic and data-integrity threats.</w:t>
       </w:r>
     </w:p>
-    <w:bookmarkEnd w:id="75"/>
     <w:bookmarkEnd w:id="76"/>
-    <w:bookmarkStart w:id="77" w:name="baseline-systems"/>
+    <w:bookmarkEnd w:id="77"/>
+    <w:bookmarkStart w:id="78" w:name="baseline-systems"/>
     <w:p>
       <w:pPr>
         <w:pStyle w:val="Heading2"/>
@@ -4249,7 +4940,7 @@
               <w:pStyle w:val="Compact"/>
             </w:pPr>
             <w:r>
-              <w:t xml:space="preserve">No AI detection, no risk scoring, no adaptive response, and no tamper-resistant logging</w:t>
+              <w:t xml:space="preserve">No AI detection, no risk scoring, no adaptive response, and no tamper-evident provenance</w:t>
             </w:r>
           </w:p>
         </w:tc>
@@ -4273,7 +4964,7 @@
               <w:pStyle w:val="Compact"/>
             </w:pPr>
             <w:r>
-              <w:t xml:space="preserve">Uses AI detection but does not include risk scoring, adaptive logic, or tamper-resistant logging</w:t>
+              <w:t xml:space="preserve">Uses AI detection but does not include risk scoring, adaptive logic, or tamper-evident provenance</w:t>
             </w:r>
           </w:p>
         </w:tc>
@@ -4297,7 +4988,7 @@
               <w:pStyle w:val="Compact"/>
             </w:pPr>
             <w:r>
-              <w:t xml:space="preserve">Uses tamper-resistant logging but does not include AI detection or adaptive mission logic</w:t>
+              <w:t xml:space="preserve">Uses tamper-evident provenance but does not include AI detection or adaptive mission logic</w:t>
             </w:r>
           </w:p>
         </w:tc>
@@ -4345,14 +5036,14 @@
               <w:pStyle w:val="Compact"/>
             </w:pPr>
             <w:r>
-              <w:t xml:space="preserve">Uses AI detection, mission-risk scoring, adaptive mission logic, and tamper-resistant logging</w:t>
+              <w:t xml:space="preserve">Uses AI detection, mission-risk scoring, adaptive mission logic, and tamper-evident provenance</w:t>
             </w:r>
           </w:p>
         </w:tc>
       </w:tr>
     </w:tbl>
-    <w:bookmarkEnd w:id="77"/>
-    <w:bookmarkStart w:id="78" w:name="ai-detection-models"/>
+    <w:bookmarkEnd w:id="78"/>
+    <w:bookmarkStart w:id="79" w:name="ai-detection-models"/>
     <w:p>
       <w:pPr>
         <w:pStyle w:val="Heading2"/>
@@ -4505,8 +5196,8 @@
         <w:t xml:space="preserve">The best-performing model is selected based on accuracy, precision, recall, and F1-score.</w:t>
       </w:r>
     </w:p>
-    <w:bookmarkEnd w:id="78"/>
-    <w:bookmarkStart w:id="79" w:name="input-features-1"/>
+    <w:bookmarkEnd w:id="79"/>
+    <w:bookmarkStart w:id="80" w:name="input-features-1"/>
     <w:p>
       <w:pPr>
         <w:pStyle w:val="Heading2"/>
@@ -4778,8 +5469,8 @@
         </w:tc>
       </w:tr>
     </w:tbl>
-    <w:bookmarkEnd w:id="79"/>
-    <w:bookmarkStart w:id="80" w:name="evaluation-metrics-1"/>
+    <w:bookmarkEnd w:id="80"/>
+    <w:bookmarkStart w:id="81" w:name="evaluation-metrics-1"/>
     <w:p>
       <w:pPr>
         <w:pStyle w:val="Heading2"/>
@@ -5099,8 +5790,8 @@
         </w:tc>
       </w:tr>
     </w:tbl>
-    <w:bookmarkEnd w:id="80"/>
-    <w:bookmarkStart w:id="81" w:name="experimental-procedure"/>
+    <w:bookmarkEnd w:id="81"/>
+    <w:bookmarkStart w:id="82" w:name="experimental-procedure"/>
     <w:p>
       <w:pPr>
         <w:pStyle w:val="Heading2"/>
@@ -5198,7 +5889,7 @@
         </w:numPr>
       </w:pPr>
       <w:r>
-        <w:t xml:space="preserve">Verify mission logs using tamper-resistant logging.</w:t>
+        <w:t xml:space="preserve">Verify mission logs using tamper-evident provenance.</w:t>
       </w:r>
     </w:p>
     <w:p>
@@ -5237,8 +5928,8 @@
         <w:t xml:space="preserve">Interpret the findings from a mission-assurance perspective.</w:t>
       </w:r>
     </w:p>
-    <w:bookmarkEnd w:id="81"/>
-    <w:bookmarkStart w:id="82" w:name="result-files"/>
+    <w:bookmarkEnd w:id="82"/>
+    <w:bookmarkStart w:id="83" w:name="result-files"/>
     <w:p>
       <w:pPr>
         <w:pStyle w:val="Heading2"/>
@@ -5509,8 +6200,8 @@
         </w:tc>
       </w:tr>
     </w:tbl>
-    <w:bookmarkEnd w:id="82"/>
-    <w:bookmarkStart w:id="83" w:name="research-integrity-statement"/>
+    <w:bookmarkEnd w:id="83"/>
+    <w:bookmarkStart w:id="84" w:name="research-integrity-statement"/>
     <w:p>
       <w:pPr>
         <w:pStyle w:val="Heading2"/>
@@ -5532,7 +6223,29 @@
         <w:pStyle w:val="BodyText"/>
       </w:pPr>
       <w:r>
-        <w:t xml:space="preserve">The results should be interpreted as simulation-based evidence of mission-assurance improvement under controlled attack scenarios. Real-world flight testing and hardware-in-the-loop validation are left for future work.</w:t>
+        <w:t xml:space="preserve">The results should be interpreted as simulation-based evidence of mission-assurance behavior under controlled attack scenarios.</w:t>
+      </w:r>
+    </w:p>
+    <w:p>
+      <w:pPr>
+        <w:pStyle w:val="BodyText"/>
+      </w:pPr>
+      <w:r>
+        <w:t xml:space="preserve">The evaluation is intentionally limited to simulation-generated telemetry. The study does not claim real military flight testing, hardware-in-the-loop validation, classified operational validation, or deployed battlefield performance. Future validation should include hardware-in-the-loop experiments, controlled RF testbed evaluation, real UAV logs where available, and cross-dataset testing against independent UAV cyber-physical security datasets.</w:t>
+      </w:r>
+      <w:r>
+        <w:t xml:space="preserve"> </w:t>
+      </w:r>
+      <w:r>
+        <w:t xml:space="preserve">Real-world flight testing and hardware-in-the-loop validation are left for future work.</w:t>
+      </w:r>
+    </w:p>
+    <w:p>
+      <w:pPr>
+        <w:pStyle w:val="BodyText"/>
+      </w:pPr>
+      <w:r>
+        <w:t xml:space="preserve">Adversarial robustness testing was limited to the binary attack-versus-normal setting because this stage represents the first mission-assurance trigger for detecting whether a mission is under cyber-physical attack. Fine-grained adversarial robustness across all eight mission-state classes is left for future work.</w:t>
       </w:r>
     </w:p>
     <w:p>
@@ -5549,8 +6262,8 @@
         </w:pict>
       </w:r>
     </w:p>
-    <w:bookmarkEnd w:id="83"/>
-    <w:bookmarkStart w:id="85" w:name="v4-prior-work-comparison"/>
+    <w:bookmarkEnd w:id="84"/>
+    <w:bookmarkStart w:id="86" w:name="v4-prior-work-comparison"/>
     <w:p>
       <w:pPr>
         <w:pStyle w:val="Heading2"/>
@@ -5559,7 +6272,7 @@
         <w:t xml:space="preserve">v4 Prior Work Comparison</w:t>
       </w:r>
     </w:p>
-    <w:bookmarkStart w:id="84" w:name="X90147a236e1e5fcb8e36b91ccd672e7d8eab3e7"/>
+    <w:bookmarkStart w:id="85" w:name="X90147a236e1e5fcb8e36b91ccd672e7d8eab3e7"/>
     <w:p>
       <w:pPr>
         <w:pStyle w:val="Heading3"/>
@@ -6498,16 +7211,16 @@
         </w:tc>
       </w:tr>
     </w:tbl>
-    <w:bookmarkEnd w:id="84"/>
     <w:bookmarkEnd w:id="85"/>
-    <w:bookmarkStart w:id="86" w:name="section-2"/>
+    <w:bookmarkEnd w:id="86"/>
+    <w:bookmarkStart w:id="87" w:name="section-2"/>
     <w:p>
       <w:pPr>
         <w:pStyle w:val="Heading2"/>
       </w:pPr>
     </w:p>
-    <w:bookmarkEnd w:id="86"/>
-    <w:bookmarkStart w:id="87" w:name="main-novelty-message"/>
+    <w:bookmarkEnd w:id="87"/>
+    <w:bookmarkStart w:id="88" w:name="main-novelty-message"/>
     <w:p>
       <w:pPr>
         <w:pStyle w:val="Heading2"/>
@@ -6521,7 +7234,7 @@
         <w:pStyle w:val="FirstParagraph"/>
       </w:pPr>
       <w:r>
-        <w:t xml:space="preserve">RA-MARS v4 differs from prior work by connecting cyber-electromagnetic attack detection, Mission Assurance Index scoring, digital twin action selection, adaptive mission continuation, and tamper-resistant mission provenance in a single mission-level framework.</w:t>
+        <w:t xml:space="preserve">RA-MARS v4 differs from prior work by connecting cyber-electromagnetic attack detection, Mission Assurance Index scoring, digital twin action selection, adaptive mission continuation, and tamper-evident mission provenance in a single mission-level framework.</w:t>
       </w:r>
     </w:p>
     <w:p>
@@ -6531,9 +7244,9 @@
         </w:pict>
       </w:r>
     </w:p>
-    <w:bookmarkEnd w:id="87"/>
     <w:bookmarkEnd w:id="88"/>
-    <w:bookmarkStart w:id="93" w:name="X7222a93729f4417ef0358d358f52de5a9e4cda1"/>
+    <w:bookmarkEnd w:id="89"/>
+    <w:bookmarkStart w:id="94" w:name="X7222a93729f4417ef0358d358f52de5a9e4cda1"/>
     <w:p>
       <w:pPr>
         <w:pStyle w:val="Heading1"/>
@@ -6813,7 +7526,7 @@
         </w:pict>
       </w:r>
     </w:p>
-    <w:bookmarkStart w:id="90" w:name="v4-digital-twin-action-selection-example"/>
+    <w:bookmarkStart w:id="91" w:name="v4-digital-twin-action-selection-example"/>
     <w:p>
       <w:pPr>
         <w:pStyle w:val="Heading2"/>
@@ -6822,7 +7535,7 @@
         <w:t xml:space="preserve">v4 Digital Twin Action Selection Example</w:t>
       </w:r>
     </w:p>
-    <w:bookmarkStart w:id="89" w:name="X92c92087f7a92c91f0f0dee7311d9d9655bfaf5"/>
+    <w:bookmarkStart w:id="90" w:name="X92c92087f7a92c91f0f0dee7311d9d9655bfaf5"/>
     <w:p>
       <w:pPr>
         <w:pStyle w:val="Heading3"/>
@@ -7177,16 +7890,16 @@
         </w:tc>
       </w:tr>
     </w:tbl>
-    <w:bookmarkEnd w:id="89"/>
     <w:bookmarkEnd w:id="90"/>
-    <w:bookmarkStart w:id="91" w:name="section-3"/>
+    <w:bookmarkEnd w:id="91"/>
+    <w:bookmarkStart w:id="92" w:name="section-3"/>
     <w:p>
       <w:pPr>
         <w:pStyle w:val="Heading2"/>
       </w:pPr>
     </w:p>
-    <w:bookmarkEnd w:id="91"/>
-    <w:bookmarkStart w:id="92" w:name="explanation"/>
+    <w:bookmarkEnd w:id="92"/>
+    <w:bookmarkStart w:id="93" w:name="explanation"/>
     <w:p>
       <w:pPr>
         <w:pStyle w:val="Heading2"/>
@@ -7203,9 +7916,9 @@
         <w:t xml:space="preserve">For each degraded mission state, the RA-MARS digital twin evaluates candidate actions using projected communication reliability, navigation trustworthiness, coverage completion, log integrity, recovery efficiency, and energy overhead. The action with the highest projected Mission Assurance Index is selected unless operational constraints require a safer fallback action.</w:t>
       </w:r>
     </w:p>
-    <w:bookmarkEnd w:id="92"/>
     <w:bookmarkEnd w:id="93"/>
-    <w:bookmarkStart w:id="99" w:name="v4-results-and-discussion"/>
+    <w:bookmarkEnd w:id="94"/>
+    <w:bookmarkStart w:id="100" w:name="v4-results-and-discussion"/>
     <w:p>
       <w:pPr>
         <w:pStyle w:val="Heading1"/>
@@ -7214,7 +7927,7 @@
         <w:t xml:space="preserve">v4 Results and Discussion</w:t>
       </w:r>
     </w:p>
-    <w:bookmarkStart w:id="94" w:name="X303970150bb9a4bac58b2ea0e802dab58060830"/>
+    <w:bookmarkStart w:id="95" w:name="X303970150bb9a4bac58b2ea0e802dab58060830"/>
     <w:p>
       <w:pPr>
         <w:pStyle w:val="Heading2"/>
@@ -7239,8 +7952,8 @@
         <w:t xml:space="preserve">The classifier input excludes derived Mission Assurance Index and component scores to avoid feature leakage. The attack-detection task includes eight mission-state classes: normal, jamming, spoofing, tampering, jamming_spoofing, jamming_tampering, spoofing_tampering, and combined.</w:t>
       </w:r>
     </w:p>
-    <w:bookmarkEnd w:id="94"/>
-    <w:bookmarkStart w:id="95" w:name="v4-temporal-attack-detection-results"/>
+    <w:bookmarkEnd w:id="95"/>
+    <w:bookmarkStart w:id="96" w:name="v4-temporal-attack-detection-results"/>
     <w:p>
       <w:pPr>
         <w:pStyle w:val="Heading2"/>
@@ -7254,7 +7967,7 @@
         <w:pStyle w:val="FirstParagraph"/>
       </w:pPr>
       <w:r>
-        <w:t xml:space="preserve">The v4 model evaluation compares classical baselines, binary LSTM/GRU models, and fine-grained weighted sequence models. For binary attack-versus-normal mission assurance classification, Binary LSTM achieved 99.85% accuracy and 99.81% macro F1-score, while Binary GRU achieved 99.80% accuracy and 99.76% macro F1-score. For fine-grained eight-class mission-state classification, Weighted LSTM achieved 99.53% accuracy and 99.18% macro F1-score, while Weighted GRU achieved 99.24% accuracy and 98.66% macro F1-score. A 1D-CNN temporal baseline achieved 99.97% accuracy and 99.96% macro F1-score on the binary task, and 98.82% accuracy and 98.18% macro F1-score on the fine-grained task.</w:t>
+        <w:t xml:space="preserve">The completed validation evaluation compares binary LSTM/GRU sequence models, fine-grained weighted sequence models, and a 1D-CNN temporal baseline. For binary attack-versus-normal mission assurance classification, Binary LSTM achieved 99.85% accuracy and 99.81% macro F1-score, while Binary GRU achieved 99.80% accuracy and 99.76% macro F1-score. For fine-grained eight-class mission-state classification, Weighted LSTM achieved 99.53% accuracy and 99.18% macro F1-score, while Weighted GRU achieved 99.24% accuracy and 98.66% macro F1-score. A 1D-CNN temporal baseline achieved 99.97% accuracy and 99.96% macro F1-score on the binary task, and 98.82% accuracy and 98.18% macro F1-score on the fine-grained task.</w:t>
       </w:r>
     </w:p>
     <w:p>
@@ -7273,8 +7986,8 @@
         <w:t xml:space="preserve">These results are intentionally conservative and realistic because the v4 classifier uses temporal windows and excludes derived mission-assurance features from attack-classification input.</w:t>
       </w:r>
     </w:p>
-    <w:bookmarkEnd w:id="95"/>
-    <w:bookmarkStart w:id="96" w:name="v4-mission-assurance-results"/>
+    <w:bookmarkEnd w:id="96"/>
+    <w:bookmarkStart w:id="97" w:name="v4-mission-assurance-results"/>
     <w:p>
       <w:pPr>
         <w:pStyle w:val="Heading2"/>
@@ -7299,8 +8012,8 @@
         <w:t xml:space="preserve">The ablation study shows that each major RA-MARS module contributes to mission-level resilience. Removing adaptive continuation reduced mission success to 61.82%. Removing the Mission Assurance Index reduced mission success to 65.73%. Removing digital twin action selection reduced mission success to 66.51%. Removing the navigation trust module reduced mission success to 64.17%.</w:t>
       </w:r>
     </w:p>
-    <w:bookmarkEnd w:id="96"/>
-    <w:bookmarkStart w:id="97" w:name="X074d5cda1e52edcb5a4641490af044284949c04"/>
+    <w:bookmarkEnd w:id="97"/>
+    <w:bookmarkStart w:id="98" w:name="X074d5cda1e52edcb5a4641490af044284949c04"/>
     <w:p>
       <w:pPr>
         <w:pStyle w:val="Heading2"/>
@@ -7325,8 +8038,8 @@
         <w:t xml:space="preserve">Attack-intensity stress testing shows the expected degradation pattern. Mission success decreased from 81.34 ± 0.17% under low-intensity attacks to 79.70 ± 0.36% under medium-intensity attacks and 76.98 ± 0.62% under high-intensity attacks.</w:t>
       </w:r>
     </w:p>
-    <w:bookmarkEnd w:id="97"/>
-    <w:bookmarkStart w:id="98" w:name="v4-discussion"/>
+    <w:bookmarkEnd w:id="98"/>
+    <w:bookmarkStart w:id="99" w:name="v4-discussion"/>
     <w:p>
       <w:pPr>
         <w:pStyle w:val="Heading2"/>
@@ -7366,15 +8079,15 @@
         </w:pict>
       </w:r>
     </w:p>
-    <w:bookmarkEnd w:id="98"/>
     <w:bookmarkEnd w:id="99"/>
-    <w:bookmarkStart w:id="109" w:name="section-4"/>
+    <w:bookmarkEnd w:id="100"/>
+    <w:bookmarkStart w:id="110" w:name="section-4"/>
     <w:p>
       <w:pPr>
         <w:pStyle w:val="Heading1"/>
       </w:pPr>
     </w:p>
-    <w:bookmarkStart w:id="104" w:name="software-safe-attack-emulation-model"/>
+    <w:bookmarkStart w:id="105" w:name="software-safe-attack-emulation-model"/>
     <w:p>
       <w:pPr>
         <w:pStyle w:val="Heading2"/>
@@ -7391,7 +8104,7 @@
         <w:t xml:space="preserve">To support safe and reproducible defence-oriented evaluation, this study uses software-emulated attack models rather than real RF jamming, real GNSS spoofing, or unsafe electromagnetic experimentation. The purpose of the attack-emulation model is to reproduce mission-level degradation patterns that affect communication reliability, navigation trustworthiness, log integrity, and adaptive mission continuation.</w:t>
       </w:r>
     </w:p>
-    <w:bookmarkStart w:id="100" w:name="jamming-like-communication-degradation"/>
+    <w:bookmarkStart w:id="101" w:name="jamming-like-communication-degradation"/>
     <w:p>
       <w:pPr>
         <w:pStyle w:val="Heading3"/>
@@ -7408,8 +8121,8 @@
         <w:t xml:space="preserve">Jamming-like degradation is modeled by increasing packet loss and communication latency during selected mission intervals. Under normal operation, packet delivery probability remains close to one. During jamming-like intervals, packet delivery probability is reduced according to attack intensity, and latency is increased using an additive delay term. These values are software-controlled and are not produced by real RF transmission.</w:t>
       </w:r>
     </w:p>
-    <w:bookmarkEnd w:id="100"/>
-    <w:bookmarkStart w:id="101" w:name="spoofing-like-navigation-manipulation"/>
+    <w:bookmarkEnd w:id="101"/>
+    <w:bookmarkStart w:id="102" w:name="spoofing-like-navigation-manipulation"/>
     <w:p>
       <w:pPr>
         <w:pStyle w:val="Heading3"/>
@@ -7426,8 +8139,8 @@
         <w:t xml:space="preserve">Spoofing-like navigation degradation is modeled by injecting controlled drift and jump effects into UAV position telemetry. Gradual drift represents slow navigation deviation, while sudden jump components represent abrupt spoofing-like location changes. Route deviation and GPS drift are then computed from the difference between expected and reported positions.</w:t>
       </w:r>
     </w:p>
-    <w:bookmarkEnd w:id="101"/>
-    <w:bookmarkStart w:id="102" w:name="mission-log-tampering-emulation"/>
+    <w:bookmarkEnd w:id="102"/>
+    <w:bookmarkStart w:id="103" w:name="mission-log-tampering-emulation"/>
     <w:p>
       <w:pPr>
         <w:pStyle w:val="Heading3"/>
@@ -7444,8 +8157,8 @@
         <w:t xml:space="preserve">Mission-log tampering is modeled by modifying selected telemetry records after collection. RA-MARS uses hash-chain verification to detect integrity violations. Each record stores the previous record hash and current record hash. If a stored record is modified after logging, the recomputed hash no longer matches the stored hash, creating a tamper mismatch.</w:t>
       </w:r>
     </w:p>
-    <w:bookmarkEnd w:id="102"/>
-    <w:bookmarkStart w:id="103" w:name="combined-attack-interval"/>
+    <w:bookmarkEnd w:id="103"/>
+    <w:bookmarkStart w:id="104" w:name="combined-attack-interval"/>
     <w:p>
       <w:pPr>
         <w:pStyle w:val="Heading3"/>
@@ -7470,9 +8183,9 @@
         <w:t xml:space="preserve">These attack models are intentionally software-safe and reproducible. They support controlled mission-assurance evaluation, but they do not replace real RF-channel testing, GNSS spoofing testbeds, hardware-in-the-loop validation, or real UAV flight experiments.</w:t>
       </w:r>
     </w:p>
-    <w:bookmarkEnd w:id="103"/>
     <w:bookmarkEnd w:id="104"/>
-    <w:bookmarkStart w:id="105" w:name="validation-layer-comparison"/>
+    <w:bookmarkEnd w:id="105"/>
+    <w:bookmarkStart w:id="106" w:name="validation-layer-comparison"/>
     <w:p>
       <w:pPr>
         <w:pStyle w:val="Heading2"/>
@@ -7800,8 +8513,8 @@
         <w:t xml:space="preserve">The comparison shows that the present study provides simulation-based and PX4-style telemetry-emulation evidence. It does not claim real PX4/Gazebo SITL execution, hardware-in-the-loop validation, real UAV flight testing, or battlefield deployment.</w:t>
       </w:r>
     </w:p>
-    <w:bookmarkEnd w:id="105"/>
-    <w:bookmarkStart w:id="106" w:name="X9fda0b8d33de5468498228bc1e8e68c1f989afe"/>
+    <w:bookmarkEnd w:id="106"/>
+    <w:bookmarkStart w:id="107" w:name="X9fda0b8d33de5468498228bc1e8e68c1f989afe"/>
     <w:p>
       <w:pPr>
         <w:pStyle w:val="Heading2"/>
@@ -7866,8 +8579,8 @@
         <w:t xml:space="preserve">Limitations and Future Work</w:t>
       </w:r>
     </w:p>
-    <w:bookmarkEnd w:id="106"/>
-    <w:bookmarkStart w:id="107" w:name="limitations-1"/>
+    <w:bookmarkEnd w:id="107"/>
+    <w:bookmarkStart w:id="108" w:name="limitations-1"/>
     <w:p>
       <w:pPr>
         <w:pStyle w:val="Heading2"/>
@@ -7905,7 +8618,7 @@
         <w:pStyle w:val="BodyText"/>
       </w:pPr>
       <w:r>
-        <w:t xml:space="preserve">Third, the proposed tamper-resistant logging module is modeled using a lightweight hash-chain or blockchain-inspired structure. While this approach supports mission-record integrity verification, the study does not claim full-scale deployment of a production blockchain network in operational defence UAV systems.</w:t>
+        <w:t xml:space="preserve">Third, the proposed tamper-evident provenance module is modeled using a lightweight hash-chain or blockchain-inspired structure. While this approach supports mission-record integrity verification, the study does not claim full-scale deployment of a production blockchain network in operational defence UAV systems.</w:t>
       </w:r>
     </w:p>
     <w:p>
@@ -7932,8 +8645,8 @@
         <w:t xml:space="preserve">Finally, the framework focuses on mission assurance for surveillance-oriented multi-UAV operations. Additional validation would be required before applying the framework to other defence missions such as strike coordination, logistics, electronic attack, or manned-unmanned teaming.</w:t>
       </w:r>
     </w:p>
-    <w:bookmarkEnd w:id="107"/>
-    <w:bookmarkStart w:id="108" w:name="future-work"/>
+    <w:bookmarkEnd w:id="108"/>
+    <w:bookmarkStart w:id="109" w:name="future-work"/>
     <w:p>
       <w:pPr>
         <w:pStyle w:val="Heading2"/>
@@ -7971,7 +8684,7 @@
         <w:pStyle w:val="BodyText"/>
       </w:pPr>
       <w:r>
-        <w:t xml:space="preserve">Third, the tamper-resistant logging module can be extended using lightweight distributed ledger architectures optimized for resource-constrained UAV swarms.</w:t>
+        <w:t xml:space="preserve">Third, the tamper-evident provenance module can be extended using lightweight distributed ledger architectures optimized for resource-constrained UAV swarms.</w:t>
       </w:r>
     </w:p>
     <w:p>
@@ -8005,9 +8718,9 @@
         </w:pict>
       </w:r>
     </w:p>
-    <w:bookmarkEnd w:id="108"/>
     <w:bookmarkEnd w:id="109"/>
-    <w:bookmarkStart w:id="110" w:name="conclusion"/>
+    <w:bookmarkEnd w:id="110"/>
+    <w:bookmarkStart w:id="111" w:name="conclusion"/>
     <w:p>
       <w:pPr>
         <w:pStyle w:val="Heading1"/>
@@ -8021,7 +8734,7 @@
         <w:pStyle w:val="FirstParagraph"/>
       </w:pPr>
       <w:r>
-        <w:t xml:space="preserve">This paper proposed RA-MARS, a cross-layer mission assurance digital twin for secure multi-UAV defence surveillance under cyber-electromagnetic and navigation attacks. The framework addresses radio-frequency jamming, GPS/GNSS spoofing, mission-data tampering, and combined attacks by linking temporal attack detection, Mission Assurance Index scoring, digital twin-based action selection, adaptive mission continuation, and tamper-resistant mission provenance.</w:t>
+        <w:t xml:space="preserve">This paper proposed RA-MARS, a cross-layer mission assurance digital twin for secure multi-UAV defence surveillance under cyber-electromagnetic and navigation attacks. The framework addresses radio-frequency jamming, GPS/GNSS spoofing, mission-data tampering, and combined attacks by linking temporal attack detection, Mission Assurance Index scoring, digital twin-based action selection, adaptive mission continuation, and tamper-evident mission provenance.</w:t>
       </w:r>
     </w:p>
     <w:p>
@@ -8037,7 +8750,7 @@
         <w:pStyle w:val="BodyText"/>
       </w:pPr>
       <w:r>
-        <w:t xml:space="preserve">The physics-based v4 evaluation used synthetic multi-UAV telemetry data with 90,000 sampled telemetry rows and 82,875 time-series windows. Each window contained 20 telemetry steps and 9 raw non-leakage features per step. Derived Mission Assurance Index and component scores were excluded from classifier inputs to avoid feature leakage. For attack-versus-normal mission assurance classification, Binary LSTM achieved 99.85% accuracy and 99.81% macro F1-score, while Binary GRU achieved 99.80% accuracy and 99.76% macro F1-score. For fine-grained eight-class mission-state classification, Weighted LSTM achieved 99.53% accuracy and 99.18% macro F1-score, while Weighted GRU achieved 99.24% accuracy and 98.66% macro F1-score. A 1D-CNN temporal baseline achieved 99.97% accuracy and 99.96% macro F1-score on the binary task, and 98.82% accuracy and 98.18% macro F1-score on the fine-grained task.</w:t>
+        <w:t xml:space="preserve">The completed physics-informed evaluation used synthetic multi-UAV telemetry data with 90,000 sampled telemetry rows and 82,875 time-series windows. Each window contained 20 telemetry steps and 9 raw non-leakage features per step. Derived Mission Assurance Index and component scores were excluded from classifier inputs to avoid feature leakage. For attack-versus-normal mission assurance classification, Binary LSTM achieved 99.85% accuracy and 99.81% macro F1-score, while Binary GRU achieved 99.80% accuracy and 99.76% macro F1-score. For fine-grained eight-class mission-state classification, Weighted LSTM achieved 99.53% accuracy and 99.18% macro F1-score, while Weighted GRU achieved 99.24% accuracy and 98.66% macro F1-score. A 1D-CNN temporal baseline achieved 99.97% accuracy and 99.96% macro F1-score on the binary task, and 98.82% accuracy and 98.18% macro F1-score on the fine-grained task.</w:t>
       </w:r>
     </w:p>
     <w:p>
@@ -8071,8 +8784,8 @@
         </w:pict>
       </w:r>
     </w:p>
-    <w:bookmarkEnd w:id="110"/>
-    <w:bookmarkStart w:id="111" w:name="data-availability-statement"/>
+    <w:bookmarkEnd w:id="111"/>
+    <w:bookmarkStart w:id="112" w:name="data-availability-statement"/>
     <w:p>
       <w:pPr>
         <w:pStyle w:val="Heading1"/>
@@ -8113,8 +8826,8 @@
         <w:t xml:space="preserve">Simulation scripts, synthetic dataset generation scripts, evaluation scripts, result files, and figures will be made available in a public repository upon acceptance. Repository information is removed for double-anonymized review.</w:t>
       </w:r>
     </w:p>
-    <w:bookmarkEnd w:id="111"/>
-    <w:bookmarkStart w:id="112" w:name="code-availability-statement"/>
+    <w:bookmarkEnd w:id="112"/>
+    <w:bookmarkStart w:id="113" w:name="code-availability-statement"/>
     <w:p>
       <w:pPr>
         <w:pStyle w:val="Heading1"/>
@@ -8139,8 +8852,8 @@
         <w:t xml:space="preserve">The code and synthetic data generation scripts will be made available upon acceptance. Repository information is removed for double-anonymized review.</w:t>
       </w:r>
     </w:p>
-    <w:bookmarkEnd w:id="112"/>
-    <w:bookmarkStart w:id="118" w:name="synthetic-data-statement"/>
+    <w:bookmarkEnd w:id="113"/>
+    <w:bookmarkStart w:id="119" w:name="synthetic-data-statement"/>
     <w:p>
       <w:pPr>
         <w:pStyle w:val="Heading1"/>
@@ -8157,7 +8870,7 @@
         <w:t xml:space="preserve">This study uses simulation-generated synthetic data for controlled experimental evaluation. The data should not be interpreted as real-world UAV flight data or operational military mission data.</w:t>
       </w:r>
     </w:p>
-    <w:bookmarkStart w:id="116" w:name="figures"/>
+    <w:bookmarkStart w:id="117" w:name="figures"/>
     <w:p>
       <w:pPr>
         <w:pStyle w:val="Heading2"/>
@@ -8175,18 +8888,18 @@
           <wp:inline>
             <wp:extent cx="5334000" cy="2872153"/>
             <wp:effectExtent b="0" l="0" r="0" t="0"/>
-            <wp:docPr descr="Figure 2. RA-MARS threat model for cyber-electromagnetic and navigation attacks." title="" id="114" name="Picture"/>
+            <wp:docPr descr="Figure 2. RA-MARS threat model for cyber-electromagnetic and navigation attacks." title="" id="115" name="Picture"/>
             <a:graphic>
               <a:graphicData uri="http://schemas.openxmlformats.org/drawingml/2006/picture">
                 <pic:pic>
                   <pic:nvPicPr>
-                    <pic:cNvPr descr="../figures/threat-model/final/ra_mars_threat_model.png" id="115" name="Picture"/>
+                    <pic:cNvPr descr="../figures/threat-model/final/ra_mars_threat_model.png" id="116" name="Picture"/>
                     <pic:cNvPicPr>
                       <a:picLocks noChangeArrowheads="1" noChangeAspect="1"/>
                     </pic:cNvPicPr>
                   </pic:nvPicPr>
                   <pic:blipFill>
-                    <a:blip r:embed="rId113"/>
+                    <a:blip r:embed="rId114"/>
                     <a:stretch>
                       <a:fillRect/>
                     </a:stretch>
@@ -8221,8 +8934,8 @@
         <w:t xml:space="preserve">Figure 2. RA-MARS threat model for cyber-electromagnetic and navigation attacks.</w:t>
       </w:r>
     </w:p>
-    <w:bookmarkEnd w:id="116"/>
-    <w:bookmarkStart w:id="117" w:name="references"/>
+    <w:bookmarkEnd w:id="117"/>
+    <w:bookmarkStart w:id="118" w:name="references"/>
     <w:p>
       <w:pPr>
         <w:pStyle w:val="Heading2"/>
@@ -8575,9 +9288,9 @@
         <w:t xml:space="preserve">[43] X. Wang, Z. Zhao, L. Yi, Z. Ning, L. Guo, F. R. Yu, and S. Guo, “A Survey on Security of UAV Swarm Networks: Attacks and Countermeasures,” ACM Computing Surveys, vol. 57, no. 3, article 74, pp. 1–37, 2024, doi: 10.1145/3703625.</w:t>
       </w:r>
     </w:p>
-    <w:bookmarkEnd w:id="117"/>
     <w:bookmarkEnd w:id="118"/>
-    <w:bookmarkStart w:id="137" w:name="v5-figure-links"/>
+    <w:bookmarkEnd w:id="119"/>
+    <w:bookmarkStart w:id="138" w:name="v5-figure-links"/>
     <w:p>
       <w:pPr>
         <w:pStyle w:val="Heading1"/>
@@ -8595,12 +9308,12 @@
           <wp:inline>
             <wp:extent cx="5334000" cy="3151909"/>
             <wp:effectExtent b="0" l="0" r="0" t="0"/>
-            <wp:docPr descr="Figure 1. RA-MARS v5 model macro-F1 comparison." title="" id="120" name="Picture"/>
+            <wp:docPr descr="Figure 1. RA-MARS v5 model macro-F1 comparison." title="" id="121" name="Picture"/>
             <a:graphic>
               <a:graphicData uri="http://schemas.openxmlformats.org/drawingml/2006/picture">
                 <pic:pic>
                   <pic:nvPicPr>
-                    <pic:cNvPr descr="../figures/graphs/v5/figure_v5_model_f1_comparison.svg" id="121" name="Picture"/>
+                    <pic:cNvPr descr="../figures/graphs/v5/figure_v5_model_f1_comparison.svg" id="122" name="Picture"/>
                     <pic:cNvPicPr>
                       <a:picLocks noChangeArrowheads="1" noChangeAspect="1"/>
                     </pic:cNvPicPr>
@@ -8612,7 +9325,7 @@
                           <a14:useLocalDpi xmlns:a14="http://schemas.microsoft.com/office/drawing/2010/main" val="0"/>
                         </a:ext>
                         <a:ext uri="{96DAC541-7B7A-43D3-8B79-37D633B846F1}">
-                          <asvg:svgBlip xmlns:asvg="http://schemas.microsoft.com/office/drawing/2016/SVG/main" r:embed="rId119"/>
+                          <asvg:svgBlip xmlns:asvg="http://schemas.microsoft.com/office/drawing/2016/SVG/main" r:embed="rId120"/>
                         </a:ext>
                       </a:extLst>
                     </a:blip>
@@ -8659,12 +9372,12 @@
           <wp:inline>
             <wp:extent cx="5334000" cy="3151909"/>
             <wp:effectExtent b="0" l="0" r="0" t="0"/>
-            <wp:docPr descr="Figure 2. RA-MARS v5 mission success by scenario." title="" id="123" name="Picture"/>
+            <wp:docPr descr="Figure 2. RA-MARS v5 mission success by scenario." title="" id="124" name="Picture"/>
             <a:graphic>
               <a:graphicData uri="http://schemas.openxmlformats.org/drawingml/2006/picture">
                 <pic:pic>
                   <pic:nvPicPr>
-                    <pic:cNvPr descr="../figures/graphs/v5/figure_v5_mission_success_by_scenario.svg" id="124" name="Picture"/>
+                    <pic:cNvPr descr="../figures/graphs/v5/figure_v5_mission_success_by_scenario.svg" id="125" name="Picture"/>
                     <pic:cNvPicPr>
                       <a:picLocks noChangeArrowheads="1" noChangeAspect="1"/>
                     </pic:cNvPicPr>
@@ -8676,7 +9389,7 @@
                           <a14:useLocalDpi xmlns:a14="http://schemas.microsoft.com/office/drawing/2010/main" val="0"/>
                         </a:ext>
                         <a:ext uri="{96DAC541-7B7A-43D3-8B79-37D633B846F1}">
-                          <asvg:svgBlip xmlns:asvg="http://schemas.microsoft.com/office/drawing/2016/SVG/main" r:embed="rId122"/>
+                          <asvg:svgBlip xmlns:asvg="http://schemas.microsoft.com/office/drawing/2016/SVG/main" r:embed="rId123"/>
                         </a:ext>
                       </a:extLst>
                     </a:blip>
@@ -8723,12 +9436,12 @@
           <wp:inline>
             <wp:extent cx="5334000" cy="3151909"/>
             <wp:effectExtent b="0" l="0" r="0" t="0"/>
-            <wp:docPr descr="Figure 3. RA-MARS v5 ablation study for mission success." title="" id="126" name="Picture"/>
+            <wp:docPr descr="Figure 3. RA-MARS v5 ablation study for mission success." title="" id="127" name="Picture"/>
             <a:graphic>
               <a:graphicData uri="http://schemas.openxmlformats.org/drawingml/2006/picture">
                 <pic:pic>
                   <pic:nvPicPr>
-                    <pic:cNvPr descr="../figures/graphs/v5/figure_v5_ablation_mission_success.svg" id="127" name="Picture"/>
+                    <pic:cNvPr descr="../figures/graphs/v5/figure_v5_ablation_mission_success.svg" id="128" name="Picture"/>
                     <pic:cNvPicPr>
                       <a:picLocks noChangeArrowheads="1" noChangeAspect="1"/>
                     </pic:cNvPicPr>
@@ -8740,7 +9453,7 @@
                           <a14:useLocalDpi xmlns:a14="http://schemas.microsoft.com/office/drawing/2010/main" val="0"/>
                         </a:ext>
                         <a:ext uri="{96DAC541-7B7A-43D3-8B79-37D633B846F1}">
-                          <asvg:svgBlip xmlns:asvg="http://schemas.microsoft.com/office/drawing/2016/SVG/main" r:embed="rId125"/>
+                          <asvg:svgBlip xmlns:asvg="http://schemas.microsoft.com/office/drawing/2016/SVG/main" r:embed="rId126"/>
                         </a:ext>
                       </a:extLst>
                     </a:blip>
@@ -8787,12 +9500,12 @@
           <wp:inline>
             <wp:extent cx="5334000" cy="3151909"/>
             <wp:effectExtent b="0" l="0" r="0" t="0"/>
-            <wp:docPr descr="Figure 4. RA-MARS v5 RF/SINR validation summary." title="" id="129" name="Picture"/>
+            <wp:docPr descr="Figure 4. RA-MARS v5 RF/SINR validation summary." title="" id="130" name="Picture"/>
             <a:graphic>
               <a:graphicData uri="http://schemas.openxmlformats.org/drawingml/2006/picture">
                 <pic:pic>
                   <pic:nvPicPr>
-                    <pic:cNvPr descr="../figures/graphs/v5/figure_v5_rf_sinr_validation.svg" id="130" name="Picture"/>
+                    <pic:cNvPr descr="../figures/graphs/v5/figure_v5_rf_sinr_validation.svg" id="131" name="Picture"/>
                     <pic:cNvPicPr>
                       <a:picLocks noChangeArrowheads="1" noChangeAspect="1"/>
                     </pic:cNvPicPr>
@@ -8804,7 +9517,7 @@
                           <a14:useLocalDpi xmlns:a14="http://schemas.microsoft.com/office/drawing/2010/main" val="0"/>
                         </a:ext>
                         <a:ext uri="{96DAC541-7B7A-43D3-8B79-37D633B846F1}">
-                          <asvg:svgBlip xmlns:asvg="http://schemas.microsoft.com/office/drawing/2016/SVG/main" r:embed="rId128"/>
+                          <asvg:svgBlip xmlns:asvg="http://schemas.microsoft.com/office/drawing/2016/SVG/main" r:embed="rId129"/>
                         </a:ext>
                       </a:extLst>
                     </a:blip>
@@ -8851,12 +9564,12 @@
           <wp:inline>
             <wp:extent cx="5334000" cy="3151909"/>
             <wp:effectExtent b="0" l="0" r="0" t="0"/>
-            <wp:docPr descr="Figure 5. RA-MARS v5 detection-delay analysis." title="" id="132" name="Picture"/>
+            <wp:docPr descr="Figure 5. RA-MARS v5 detection-delay analysis." title="" id="133" name="Picture"/>
             <a:graphic>
               <a:graphicData uri="http://schemas.openxmlformats.org/drawingml/2006/picture">
                 <pic:pic>
                   <pic:nvPicPr>
-                    <pic:cNvPr descr="../figures/graphs/v5/figure_v5_detection_delay.svg" id="133" name="Picture"/>
+                    <pic:cNvPr descr="../figures/graphs/v5/figure_v5_detection_delay.svg" id="134" name="Picture"/>
                     <pic:cNvPicPr>
                       <a:picLocks noChangeArrowheads="1" noChangeAspect="1"/>
                     </pic:cNvPicPr>
@@ -8868,7 +9581,7 @@
                           <a14:useLocalDpi xmlns:a14="http://schemas.microsoft.com/office/drawing/2010/main" val="0"/>
                         </a:ext>
                         <a:ext uri="{96DAC541-7B7A-43D3-8B79-37D633B846F1}">
-                          <asvg:svgBlip xmlns:asvg="http://schemas.microsoft.com/office/drawing/2016/SVG/main" r:embed="rId131"/>
+                          <asvg:svgBlip xmlns:asvg="http://schemas.microsoft.com/office/drawing/2016/SVG/main" r:embed="rId132"/>
                         </a:ext>
                       </a:extLst>
                     </a:blip>
@@ -8915,12 +9628,12 @@
           <wp:inline>
             <wp:extent cx="5334000" cy="3151909"/>
             <wp:effectExtent b="0" l="0" r="0" t="0"/>
-            <wp:docPr descr="Figure 6. RA-MARS v5 adversarial training robustness." title="" id="135" name="Picture"/>
+            <wp:docPr descr="Figure 6. RA-MARS v5 adversarial training robustness." title="" id="136" name="Picture"/>
             <a:graphic>
               <a:graphicData uri="http://schemas.openxmlformats.org/drawingml/2006/picture">
                 <pic:pic>
                   <pic:nvPicPr>
-                    <pic:cNvPr descr="../figures/graphs/v5/figure_v5_adversarial_training_robustness.svg" id="136" name="Picture"/>
+                    <pic:cNvPr descr="../figures/graphs/v5/figure_v5_adversarial_training_robustness.svg" id="137" name="Picture"/>
                     <pic:cNvPicPr>
                       <a:picLocks noChangeArrowheads="1" noChangeAspect="1"/>
                     </pic:cNvPicPr>
@@ -8932,7 +9645,7 @@
                           <a14:useLocalDpi xmlns:a14="http://schemas.microsoft.com/office/drawing/2010/main" val="0"/>
                         </a:ext>
                         <a:ext uri="{96DAC541-7B7A-43D3-8B79-37D633B846F1}">
-                          <asvg:svgBlip xmlns:asvg="http://schemas.microsoft.com/office/drawing/2016/SVG/main" r:embed="rId134"/>
+                          <asvg:svgBlip xmlns:asvg="http://schemas.microsoft.com/office/drawing/2016/SVG/main" r:embed="rId135"/>
                         </a:ext>
                       </a:extLst>
                     </a:blip>
@@ -8970,7 +9683,7 @@
         <w:t xml:space="preserve">Figure 6. RA-MARS v5 adversarial training robustness.</w:t>
       </w:r>
     </w:p>
-    <w:bookmarkEnd w:id="137"/>
+    <w:bookmarkEnd w:id="138"/>
     <w:sectPr>
       <w:footnotePr>
         <w:numRestart w:val="eachSect"/>

</xml_diff>

<commit_message>
Refresh submission exports after baseline wording cleanup
</commit_message>
<xml_diff>
--- a/final-submission-v4/export/RA-MARS-journal-draft-final-v5-anonymous.docx
+++ b/final-submission-v4/export/RA-MARS-journal-draft-final-v5-anonymous.docx
@@ -6232,6 +6232,14 @@
       </w:pPr>
       <w:r>
         <w:t xml:space="preserve">The evaluation is intentionally limited to simulation-generated telemetry. The study does not claim real military flight testing, hardware-in-the-loop validation, classified operational validation, or deployed battlefield performance. Future validation should include hardware-in-the-loop experiments, controlled RF testbed evaluation, real UAV logs where available, and cross-dataset testing against independent UAV cyber-physical security datasets.</w:t>
+      </w:r>
+    </w:p>
+    <w:p>
+      <w:pPr>
+        <w:pStyle w:val="BodyText"/>
+      </w:pPr>
+      <w:r>
+        <w:t xml:space="preserve">A further limitation is that the current synthetic telemetry distribution may not capture all domain shifts found in real UAV operations, including sensor drift, multipath propagation, weather-dependent RF attenuation, adversarial adaptation, pilot/operator behavior, platform-specific autopilot dynamics, and unmodeled failure modes. Future work should therefore evaluate RA-MARS under cross-domain testing, independent synthetic generators, real flight logs where available, and controlled hardware-in-the-loop RF experiments.</w:t>
       </w:r>
       <w:r>
         <w:t xml:space="preserve"> </w:t>
@@ -7967,7 +7975,7 @@
         <w:pStyle w:val="FirstParagraph"/>
       </w:pPr>
       <w:r>
-        <w:t xml:space="preserve">The completed validation evaluation compares binary LSTM/GRU sequence models, fine-grained weighted sequence models, and a 1D-CNN temporal baseline. For binary attack-versus-normal mission assurance classification, Binary LSTM achieved 99.85% accuracy and 99.81% macro F1-score, while Binary GRU achieved 99.80% accuracy and 99.76% macro F1-score. For fine-grained eight-class mission-state classification, Weighted LSTM achieved 99.53% accuracy and 99.18% macro F1-score, while Weighted GRU achieved 99.24% accuracy and 98.66% macro F1-score. A 1D-CNN temporal baseline achieved 99.97% accuracy and 99.96% macro F1-score on the binary task, and 98.82% accuracy and 98.18% macro F1-score on the fine-grained task.</w:t>
+        <w:t xml:space="preserve">The completed validation evaluation compares binary LSTM/GRU sequence models, fine-grained weighted sequence models, and a 1D-CNN temporal baseline. Classical machine-learning baselines were used during development for sanity checking, but the final reported model-comparison emphasis is placed on temporal deep-learning models because the task is sequence-based. For binary attack-versus-normal mission assurance classification, Binary LSTM achieved 99.85% accuracy and 99.81% macro F1-score, while Binary GRU achieved 99.80% accuracy and 99.76% macro F1-score. For fine-grained eight-class mission-state classification, Weighted LSTM achieved 99.53% accuracy and 99.18% macro F1-score, while Weighted GRU achieved 99.24% accuracy and 98.66% macro F1-score. A 1D-CNN temporal baseline achieved 99.97% accuracy and 99.96% macro F1-score on the binary task, and 98.82% accuracy and 98.18% macro F1-score on the fine-grained task.</w:t>
       </w:r>
     </w:p>
     <w:p>
@@ -8734,7 +8742,7 @@
         <w:pStyle w:val="FirstParagraph"/>
       </w:pPr>
       <w:r>
-        <w:t xml:space="preserve">This paper proposed RA-MARS, a cross-layer mission assurance digital twin for secure multi-UAV defence surveillance under cyber-electromagnetic and navigation attacks. The framework addresses radio-frequency jamming, GPS/GNSS spoofing, mission-data tampering, and combined attacks by linking temporal attack detection, Mission Assurance Index scoring, digital twin-based action selection, adaptive mission continuation, and tamper-evident mission provenance.</w:t>
+        <w:t xml:space="preserve">This paper proposed RA-MARS, a cross-layer mission assurance digital twin for secure multi-UAV defence surveillance under cyber-electromagnetic and navigation attacks. The reported results should be interpreted as controlled simulation evidence of framework behavior rather than proof of deployed battlefield effectiveness. The framework addresses radio-frequency jamming, GPS/GNSS spoofing, mission-data tampering, and combined attacks by linking temporal attack detection, Mission Assurance Index scoring, digital twin-based action selection, adaptive mission continuation, and tamper-evident mission provenance.</w:t>
       </w:r>
     </w:p>
     <w:p>

</xml_diff>

<commit_message>
Refresh final package with AI-use declaration
</commit_message>
<xml_diff>
--- a/final-submission-v4/export/RA-MARS-journal-draft-final-v5-anonymous.docx
+++ b/final-submission-v4/export/RA-MARS-journal-draft-final-v5-anonymous.docx
@@ -8751,6 +8751,14 @@
       </w:pPr>
       <w:r>
         <w:t xml:space="preserve">Unlike isolated UAV security approaches that focus only on attack detection, anti-jamming communication, navigation trust, task allocation, or secure logging, RA-MARS evaluates resilience at the mission level. The framework is designed to support mission continuity by converting raw telemetry, communication, navigation, energy, and mission-progress indicators into operational assurance decisions.</w:t>
+      </w:r>
+    </w:p>
+    <w:p>
+      <w:pPr>
+        <w:pStyle w:val="BodyText"/>
+      </w:pPr>
+      <w:r>
+        <w:t xml:space="preserve">All result figures were generated programmatically from final CSV outputs using reproducible plotting scripts; no generative image model was used to create or modify research-result figures.</w:t>
       </w:r>
     </w:p>
     <w:p>

</xml_diff>